<commit_message>
Add Candle Range Theory content, manual now 49 pages
Adds the Candle Range Theory (CRT) — the objective HTF-bias reading
grid, already partially covered in the manual's own glossary but
never fully cross-linked. Partie VI (Fractal Model) gets a short
pointer explaining its role in the top-down GPS cascade; the full
mechanism (four named scenarios: reversal/continuation x bullish/
bearish) is detailed in Partie VII.A alongside a new diagram
(Figure 16), where it was already partially documented.

Regenerates the PDF/DOCX (48 -> 49 pages), all 49 reader page images,
and bumps the page-count stat shown on the portfolio card.

Co-Authored-By: Claude Sonnet 5 <noreply@anthropic.com>
</commit_message>
<xml_diff>
--- a/public/full-guideline-bk-boost-ipf.docx
+++ b/public/full-guideline-bk-boost-ipf.docx
@@ -343,7 +343,7 @@
           <w:sz w:val="22"/>
           <w:szCs w:val="22"/>
         </w:rPr>
-        <w:t xml:space="preserve">	37</w:t>
+        <w:t xml:space="preserve">	38</w:t>
       </w:r>
     </w:p>
     <w:p>
@@ -373,7 +373,7 @@
           <w:sz w:val="22"/>
           <w:szCs w:val="22"/>
         </w:rPr>
-        <w:t xml:space="preserve">	41</w:t>
+        <w:t xml:space="preserve">	42</w:t>
       </w:r>
     </w:p>
     <w:p>
@@ -403,7 +403,7 @@
           <w:sz w:val="22"/>
           <w:szCs w:val="22"/>
         </w:rPr>
-        <w:t xml:space="preserve">	43</w:t>
+        <w:t xml:space="preserve">	44</w:t>
       </w:r>
     </w:p>
     <w:p>
@@ -433,7 +433,7 @@
           <w:sz w:val="22"/>
           <w:szCs w:val="22"/>
         </w:rPr>
-        <w:t xml:space="preserve">	44</w:t>
+        <w:t xml:space="preserve">	45</w:t>
       </w:r>
     </w:p>
     <w:p>
@@ -3960,6 +3960,20 @@
     </w:p>
     <w:p>
       <w:pPr>
+        <w:spacing w:after="160" w:line="300"/>
+        <w:jc w:val="both"/>
+      </w:pPr>
+      <w:r>
+        <w:rPr>
+          <w:color w:val="1F2937"/>
+          <w:sz w:val="22"/>
+          <w:szCs w:val="22"/>
+        </w:rPr>
+        <w:t xml:space="preserve">Comment le Monthly, le Weekly ou le Daily « donnent » concrètement cette direction — plutôt que de rester une affirmation abstraite — est le rôle exact du Candle Range Theory : la grille de lecture du range d'une bougie HTF, détaillée en Partie VII.A. Elle est la première brique du GPS séquentiel décrit ici : sans elle, « le HTF donne la direction » resterait une intuition plutôt qu'une lecture reproductible.</w:t>
+      </w:r>
+    </w:p>
+    <w:p>
+      <w:pPr>
         <w:pStyle w:val="Heading2"/>
         <w:keepNext/>
         <w:keepLines/>
@@ -4447,7 +4461,7 @@
         </w:rPr>
         <w:t xml:space="preserve">Ressources pour l'analyse fondamentale — </w:t>
       </w:r>
-      <w:hyperlink w:history="1" r:id="rIdka-mq-hdiuwsgvhfmi6zj">
+      <w:hyperlink w:history="1" r:id="rIdlyyhlekxtiiaiuzp7swfw">
         <w:r>
           <w:rPr>
             <w:i/>
@@ -4468,7 +4482,7 @@
         </w:rPr>
         <w:t xml:space="preserve">   ·   </w:t>
       </w:r>
-      <w:hyperlink w:history="1" r:id="rIdem2d2un_hfppbofok3mze">
+      <w:hyperlink w:history="1" r:id="rIdm60rrztcw6gal40kmig5d">
         <w:r>
           <w:rPr>
             <w:i/>
@@ -4489,7 +4503,7 @@
         </w:rPr>
         <w:t xml:space="preserve">   ·   </w:t>
       </w:r>
-      <w:hyperlink w:history="1" r:id="rIdkfiu5u5_uzwkmuffax_vj">
+      <w:hyperlink w:history="1" r:id="rIdq1um5p0mg7fy2akz-frb4">
         <w:r>
           <w:rPr>
             <w:i/>
@@ -4609,7 +4623,7 @@
         </w:rPr>
         <w:t xml:space="preserve">Ressource pour l'analyse sentimentale — </w:t>
       </w:r>
-      <w:hyperlink w:history="1" r:id="rIdzrjpiwqmz00wei0khztlk">
+      <w:hyperlink w:history="1" r:id="rIdf7bo6zznz5o1qd_3dybi6">
         <w:r>
           <w:rPr>
             <w:i/>
@@ -5078,896 +5092,16 @@
     </w:p>
     <w:p>
       <w:pPr>
-        <w:pStyle w:val="Heading3"/>
-        <w:keepNext/>
-        <w:keepLines/>
-      </w:pPr>
-      <w:r>
-        <w:t xml:space="preserve">Le narratif du jour</w:t>
-      </w:r>
-    </w:p>
-    <w:p>
-      <w:pPr>
-        <w:spacing w:after="160" w:line="300"/>
-        <w:jc w:val="both"/>
-      </w:pPr>
-      <w:r>
-        <w:rPr>
-          <w:color w:val="1F2937"/>
-          <w:sz w:val="22"/>
-          <w:szCs w:val="22"/>
-        </w:rPr>
-        <w:t xml:space="preserve">Une fois la cascade lue, le DXY et le VIX vérifiés, la phase de marché et la Candle Science établies, tout se résume en une phrase de cadrage — le narratif du jour. Exemple donné par les outils sources : « Le Daily est en expansion haussière, le H4 est en pullback dans cette expansion, et le H1 montre des signes de reprise haussière. » Cette phrase, et elle seule, doit suffire à orienter la recherche de la suite (Étape P) : si elle ne peut pas être formulée sans hésitation, ce n'est pas encore le moment de chercher un POI.</w:t>
-      </w:r>
-    </w:p>
-    <w:p>
-      <w:pPr>
-        <w:spacing w:after="160" w:line="300"/>
-        <w:jc w:val="both"/>
-      </w:pPr>
-      <w:r>
-        <w:rPr>
-          <w:color w:val="1F2937"/>
-          <w:sz w:val="22"/>
-          <w:szCs w:val="22"/>
-        </w:rPr>
-        <w:t xml:space="preserve">Deux derniers filtres, indépendants du narratif mais tout aussi bloquants, doivent malgré tout être vérifiés avant toute action : l'actualité économique, et la fenêtre horaire.</w:t>
-      </w:r>
-    </w:p>
-    <w:p>
-      <w:pPr>
-        <w:pStyle w:val="Heading3"/>
-        <w:keepNext/>
-        <w:keepLines/>
-      </w:pPr>
-      <w:r>
-        <w:t xml:space="preserve">Le filtre fondamental : news et calendrier économique</w:t>
-      </w:r>
-    </w:p>
-    <w:p>
-      <w:pPr>
-        <w:spacing w:after="160" w:line="300"/>
-        <w:jc w:val="both"/>
-      </w:pPr>
-      <w:r>
-        <w:rPr>
-          <w:color w:val="1F2937"/>
-          <w:sz w:val="22"/>
-          <w:szCs w:val="22"/>
-        </w:rPr>
-        <w:t xml:space="preserve">Aucune analyse ni aucun trade ne doit être envisagé si une annonce économique majeure (NFP, CPI, FOMC, ISM, discours de la Présidence de la Fed — signalées par une icône rouge sur Forex Factory ou équivalent) tombe dans les 30 minutes qui suivent. Ce filtre est un blocage, pas un avertissement : la case « calendrier économique consulté » doit être cochée explicitement. L'absence de vérification n'équivaut jamais à un feu vert.</w:t>
-      </w:r>
-    </w:p>
-    <w:p>
-      <w:pPr>
-        <w:pStyle w:val="Heading3"/>
-        <w:keepNext/>
-        <w:keepLines/>
-      </w:pPr>
-      <w:r>
-        <w:t xml:space="preserve">Les Kill Zones : les fenêtres où les institutions agissent réellement</w:t>
-      </w:r>
-    </w:p>
-    <w:p>
-      <w:pPr>
-        <w:spacing w:after="160" w:line="300"/>
-        <w:jc w:val="both"/>
-      </w:pPr>
-      <w:r>
-        <w:rPr>
-          <w:b/>
-          <w:bCs/>
-          <w:color w:val="1E3A8A"/>
-          <w:sz w:val="22"/>
-          <w:szCs w:val="22"/>
-        </w:rPr>
-        <w:t xml:space="preserve">Quoi — </w:t>
-      </w:r>
-      <w:r>
-        <w:rPr>
-          <w:color w:val="1F2937"/>
-          <w:sz w:val="22"/>
-          <w:szCs w:val="22"/>
-        </w:rPr>
-        <w:t xml:space="preserve">Les fenêtres horaires pendant lesquelles le volume institutionnel réel est concentré : Asian 3h00–7h00 UTC, London 7h00–12h00 UTC, NY AM 13h00–17h00 UTC.</w:t>
-      </w:r>
-    </w:p>
-    <w:p>
-      <w:pPr>
-        <w:spacing w:after="160" w:line="300"/>
-        <w:jc w:val="both"/>
-      </w:pPr>
-      <w:r>
-        <w:rPr>
-          <w:b/>
-          <w:bCs/>
-          <w:color w:val="B45309"/>
-          <w:sz w:val="22"/>
-          <w:szCs w:val="22"/>
-        </w:rPr>
-        <w:t xml:space="preserve">Pourquoi — </w:t>
-      </w:r>
-      <w:r>
-        <w:rPr>
-          <w:color w:val="1F2937"/>
-          <w:sz w:val="22"/>
-          <w:szCs w:val="22"/>
-        </w:rPr>
-        <w:t xml:space="preserve">En dehors de ces fenêtres, le marché est piloté par un volume trop faible et trop dispersé pour que la lecture institutionnelle de ce manuel s'applique de façon fiable — hors Kill Zone, on observe, on n'exécute jamais.</w:t>
-      </w:r>
-    </w:p>
-    <w:p>
-      <w:pPr>
-        <w:spacing w:after="160" w:line="300"/>
-        <w:jc w:val="both"/>
-      </w:pPr>
-      <w:r>
-        <w:rPr>
-          <w:b/>
-          <w:bCs/>
-          <w:color w:val="047857"/>
-          <w:sz w:val="22"/>
-          <w:szCs w:val="22"/>
-        </w:rPr>
-        <w:t xml:space="preserve">Comment s'y prendre — </w:t>
-      </w:r>
-      <w:r>
-        <w:rPr>
-          <w:color w:val="1F2937"/>
-          <w:sz w:val="22"/>
-          <w:szCs w:val="22"/>
-        </w:rPr>
-        <w:t xml:space="preserve">Vérifier l'heure UTC actuelle par rapport aux trois fenêtres ci-dessus avant d'envisager la moindre entrée ; noter que l'outil Plan du Jour IPF affiche ces mêmes fenêtres converties dynamiquement en heure de Goma (UTC+2, avec bascule automatique lors du passage à l'heure d'hiver/été américaine, début novembre à mi-mars) — les deux affichages désignent la même fenêtre réelle.</w:t>
-      </w:r>
-    </w:p>
-    <w:p>
-      <w:pPr>
-        <w:spacing w:after="160"/>
-        <w:jc w:val="both"/>
-      </w:pPr>
-      <w:r>
-        <w:rPr>
-          <w:b/>
-          <w:bCs/>
-          <w:i/>
-          <w:iCs/>
-          <w:color w:val="1F2937"/>
-          <w:sz w:val="22"/>
-          <w:szCs w:val="22"/>
-        </w:rPr>
-        <w:t xml:space="preserve">Lien avec IPF — </w:t>
-      </w:r>
-      <w:r>
-        <w:rPr>
-          <w:i/>
-          <w:iCs/>
-          <w:color w:val="1F2937"/>
-          <w:sz w:val="22"/>
-          <w:szCs w:val="22"/>
-        </w:rPr>
-        <w:t xml:space="preserve">C'est la condition 01 du Verdict (Partie VIII) : Kill Zone active, sans quoi toute autre condition devient secondaire.</w:t>
-      </w:r>
-    </w:p>
-    <w:p>
-      <w:pPr>
-        <w:keepNext/>
-        <w:keepLines/>
-        <w:pBdr>
-          <w:left w:val="single" w:color="047857" w:sz="24" w:space="8"/>
-        </w:pBdr>
-        <w:shd w:fill="E1F3EC" w:val="clear"/>
-        <w:spacing w:after="60" w:before="200"/>
-      </w:pPr>
-      <w:r>
-        <w:rPr>
-          <w:b/>
-          <w:bCs/>
-          <w:color w:val="047857"/>
-          <w:sz w:val="22"/>
-          <w:szCs w:val="22"/>
-        </w:rPr>
-        <w:t xml:space="preserve">Questions de vérification</w:t>
-      </w:r>
-    </w:p>
-    <w:p>
-      <w:pPr>
-        <w:keepNext/>
-        <w:keepLines/>
-        <w:pBdr>
-          <w:left w:val="single" w:color="047857" w:sz="24" w:space="8"/>
-        </w:pBdr>
-        <w:shd w:fill="E1F3EC" w:val="clear"/>
-        <w:spacing w:after="80" w:line="280"/>
-        <w:jc w:val="both"/>
-      </w:pPr>
-      <w:r>
-        <w:rPr>
-          <w:i/>
-          <w:iCs/>
-          <w:color w:val="1F2937"/>
-          <w:sz w:val="21"/>
-          <w:szCs w:val="21"/>
-        </w:rPr>
-        <w:t xml:space="preserve">• Est-ce que je peux citer les trois Kill Zones et leurs horaires UTC sans les chercher ?</w:t>
-      </w:r>
-    </w:p>
-    <w:p>
-      <w:pPr>
-        <w:keepNext w:val="false"/>
-        <w:keepLines/>
-        <w:pBdr>
-          <w:left w:val="single" w:color="047857" w:sz="24" w:space="8"/>
-        </w:pBdr>
-        <w:shd w:fill="E1F3EC" w:val="clear"/>
-        <w:spacing w:after="200" w:line="280"/>
-        <w:jc w:val="both"/>
-      </w:pPr>
-      <w:r>
-        <w:rPr>
-          <w:i/>
-          <w:iCs/>
-          <w:color w:val="1F2937"/>
-          <w:sz w:val="21"/>
-          <w:szCs w:val="21"/>
-        </w:rPr>
-        <w:t xml:space="preserve">• Si l'heure de Goma affichée par l'outil ne correspond pas, à première vue, à ce que j'ai mémorisé en UTC, est-ce que je sais pourquoi (bascule hiver/été américaine) plutôt que de m'alarmer ?</w:t>
-      </w:r>
-    </w:p>
-    <w:p>
-      <w:pPr>
-        <w:keepNext/>
-        <w:keepLines/>
-        <w:pBdr>
-          <w:left w:val="single" w:color="047857" w:sz="24" w:space="8"/>
-        </w:pBdr>
-        <w:shd w:fill="E1F3EC" w:val="clear"/>
-        <w:spacing w:after="60" w:before="200"/>
-      </w:pPr>
-      <w:r>
-        <w:rPr>
-          <w:b/>
-          <w:bCs/>
-          <w:color w:val="047857"/>
-          <w:sz w:val="22"/>
-          <w:szCs w:val="22"/>
-        </w:rPr>
-        <w:t xml:space="preserve">Questions de vérification</w:t>
-      </w:r>
-    </w:p>
-    <w:p>
-      <w:pPr>
-        <w:keepNext/>
-        <w:keepLines/>
-        <w:pBdr>
-          <w:left w:val="single" w:color="047857" w:sz="24" w:space="8"/>
-        </w:pBdr>
-        <w:shd w:fill="E1F3EC" w:val="clear"/>
-        <w:spacing w:after="80" w:line="280"/>
-        <w:jc w:val="both"/>
-      </w:pPr>
-      <w:r>
-        <w:rPr>
-          <w:i/>
-          <w:iCs/>
-          <w:color w:val="1F2937"/>
-          <w:sz w:val="21"/>
-          <w:szCs w:val="21"/>
-        </w:rPr>
-        <w:t xml:space="preserve">• Si l'on me demandait de formuler le narratif du jour à partir d'un graphique donné, en une seule phrase et sans notes, saurais-je le faire ?</w:t>
-      </w:r>
-    </w:p>
-    <w:p>
-      <w:pPr>
-        <w:keepNext/>
-        <w:keepLines/>
-        <w:pBdr>
-          <w:left w:val="single" w:color="047857" w:sz="24" w:space="8"/>
-        </w:pBdr>
-        <w:shd w:fill="E1F3EC" w:val="clear"/>
-        <w:spacing w:after="80" w:line="280"/>
-        <w:jc w:val="both"/>
-      </w:pPr>
-      <w:r>
-        <w:rPr>
-          <w:i/>
-          <w:iCs/>
-          <w:color w:val="1F2937"/>
-          <w:sz w:val="21"/>
-          <w:szCs w:val="21"/>
-        </w:rPr>
-        <w:t xml:space="preserve">• Est-ce que je comprends pourquoi une convergence Fragile (DXY et VIX contraires à la lecture technique) doit primer sur un signal technique par ailleurs valide ?</w:t>
-      </w:r>
-    </w:p>
-    <w:p>
-      <w:pPr>
-        <w:keepNext/>
-        <w:keepLines/>
-        <w:pBdr>
-          <w:left w:val="single" w:color="047857" w:sz="24" w:space="8"/>
-        </w:pBdr>
-        <w:shd w:fill="E1F3EC" w:val="clear"/>
-        <w:spacing w:after="80" w:line="280"/>
-        <w:jc w:val="both"/>
-      </w:pPr>
-      <w:r>
-        <w:rPr>
-          <w:i/>
-          <w:iCs/>
-          <w:color w:val="1F2937"/>
-          <w:sz w:val="21"/>
-          <w:szCs w:val="21"/>
-        </w:rPr>
-        <w:t xml:space="preserve">• Est-ce que je peux expliquer pourquoi la Candle Range Theory ne doit jamais être appliquée en dessous du Daily ?</w:t>
-      </w:r>
-    </w:p>
-    <w:p>
-      <w:pPr>
-        <w:keepNext w:val="false"/>
-        <w:keepLines/>
-        <w:pBdr>
-          <w:left w:val="single" w:color="047857" w:sz="24" w:space="8"/>
-        </w:pBdr>
-        <w:shd w:fill="E1F3EC" w:val="clear"/>
-        <w:spacing w:after="200" w:line="280"/>
-        <w:jc w:val="both"/>
-      </w:pPr>
-      <w:r>
-        <w:rPr>
-          <w:i/>
-          <w:iCs/>
-          <w:color w:val="1F2937"/>
-          <w:sz w:val="21"/>
-          <w:szCs w:val="21"/>
-        </w:rPr>
-        <w:t xml:space="preserve">• Est-ce que je sais, pour le style de trading que je pratique, quelle paire de timeframes sert d'ancrage à la règle de biais ?</w:t>
-      </w:r>
-    </w:p>
-    <w:p>
-      <w:r>
-        <w:br w:type="page"/>
-      </w:r>
-    </w:p>
-    <w:p>
-      <w:pPr>
-        <w:pStyle w:val="Heading2"/>
-        <w:keepNext/>
-        <w:keepLines/>
-      </w:pPr>
-      <w:r>
-        <w:t xml:space="preserve">B. Étape P — Price Action &amp; Liquidité</w:t>
-      </w:r>
-    </w:p>
-    <w:p>
-      <w:pPr>
-        <w:spacing w:after="160" w:line="300"/>
-        <w:jc w:val="both"/>
-      </w:pPr>
-      <w:r>
-        <w:rPr>
-          <w:color w:val="1F2937"/>
-          <w:sz w:val="22"/>
-          <w:szCs w:val="22"/>
-        </w:rPr>
-        <w:t xml:space="preserve">Une fois la direction établie (Étape I), l'Étape P répond à la question suivante : où, précisément, le prix est-il susceptible d'aller, et depuis quelle zone institutionnelle peut-il y réagir ? C'est l'étape de la cartographie — celle qui transforme un biais en une zone exploitable.</w:t>
-      </w:r>
-    </w:p>
-    <w:p>
-      <w:pPr>
-        <w:pStyle w:val="Heading3"/>
-        <w:keepNext/>
-        <w:keepLines/>
-      </w:pPr>
-      <w:r>
-        <w:t xml:space="preserve">Le cycle IRL ↔ ERL, appliqué à la sélection de zone</w:t>
-      </w:r>
-    </w:p>
-    <w:p>
-      <w:pPr>
-        <w:spacing w:after="160" w:line="300"/>
-        <w:jc w:val="both"/>
-      </w:pPr>
-      <w:r>
-        <w:rPr>
-          <w:color w:val="1F2937"/>
-          <w:sz w:val="22"/>
-          <w:szCs w:val="22"/>
-        </w:rPr>
-        <w:t xml:space="preserve">Avant toute recherche de zone, il faut situer la position actuelle du prix dans le cycle IRL↔ERL (défini en Partie VII.A) : si le marché est en Expansion (IRL→ERL), la zone d'entrée a déjà été quittée et il faut attendre soit une nouvelle formation, soit le pullback à venir ; si le marché est en Pullback (ERL→IRL), c'est le moment où la recherche de POI a un sens. Chercher un POI pendant une Expansion revient à chercher une porte d'entrée sur un train déjà parti.</w:t>
-      </w:r>
-    </w:p>
-    <w:p>
-      <w:pPr>
-        <w:pStyle w:val="Heading3"/>
-        <w:keepNext/>
-        <w:keepLines/>
-      </w:pPr>
-      <w:r>
-        <w:t xml:space="preserve">DOL : quelle cible viser réellement</w:t>
-      </w:r>
-    </w:p>
-    <w:p>
-      <w:pPr>
-        <w:keepNext/>
-        <w:keepLines/>
-        <w:spacing w:after="80" w:before="200"/>
-      </w:pPr>
-      <w:r>
-        <w:rPr>
-          <w:b/>
-          <w:bCs/>
-          <w:color w:val="1E3A8A"/>
-          <w:sz w:val="22"/>
-          <w:szCs w:val="22"/>
-        </w:rPr>
-        <w:t xml:space="preserve">DOL (Draw On Liquidity) global et immédiat</w:t>
-      </w:r>
-    </w:p>
-    <w:p>
-      <w:pPr>
-        <w:spacing w:after="160" w:line="300"/>
-        <w:jc w:val="both"/>
-      </w:pPr>
-      <w:r>
-        <w:rPr>
-          <w:b/>
-          <w:bCs/>
-          <w:color w:val="1E3A8A"/>
-          <w:sz w:val="22"/>
-          <w:szCs w:val="22"/>
-        </w:rPr>
-        <w:t xml:space="preserve">Quoi — </w:t>
-      </w:r>
-      <w:r>
-        <w:rPr>
-          <w:color w:val="1F2937"/>
-          <w:sz w:val="22"/>
-          <w:szCs w:val="22"/>
-        </w:rPr>
-        <w:t xml:space="preserve">Le DOL est l'attraction du prix vers une poche de liquidité — une destination probable, jamais une garantie. Le DOL global est l'extrême final du range, la vraie cible. Le DOL immédiat est la liquidité la plus proche, et c'est très souvent un simple appât (un IDM) plutôt qu'une vraie destination.</w:t>
-      </w:r>
-    </w:p>
-    <w:p>
-      <w:pPr>
-        <w:spacing w:after="160" w:line="300"/>
-        <w:jc w:val="both"/>
-      </w:pPr>
-      <w:r>
-        <w:rPr>
-          <w:b/>
-          <w:bCs/>
-          <w:color w:val="B45309"/>
-          <w:sz w:val="22"/>
-          <w:szCs w:val="22"/>
-        </w:rPr>
-        <w:t xml:space="preserve">Pourquoi — </w:t>
-      </w:r>
-      <w:r>
-        <w:rPr>
-          <w:color w:val="1F2937"/>
-          <w:sz w:val="22"/>
-          <w:szCs w:val="22"/>
-        </w:rPr>
-        <w:t xml:space="preserve">Confondre les deux est l'une des erreurs les plus coûteuses de la méthode : viser le DOL immédiat revient à prendre un profit sur l'appât plutôt que sur la vraie cible, et surtout à placer un Take Profit sur un niveau que l'IPDA n'a jamais eu l'intention de respecter comme destination finale.</w:t>
-      </w:r>
-    </w:p>
-    <w:p>
-      <w:pPr>
-        <w:spacing w:after="60"/>
-        <w:jc w:val="both"/>
-      </w:pPr>
-      <w:r>
-        <w:rPr>
-          <w:b/>
-          <w:bCs/>
-          <w:color w:val="047857"/>
-          <w:sz w:val="22"/>
-          <w:szCs w:val="22"/>
-        </w:rPr>
-        <w:t xml:space="preserve">Comment s'y prendre —</w:t>
-      </w:r>
-    </w:p>
-    <w:p>
-      <w:pPr>
-        <w:pStyle w:val="ListParagraph"/>
-        <w:numPr>
-          <w:ilvl w:val="0"/>
-          <w:numId w:val="2"/>
-        </w:numPr>
-        <w:spacing w:after="120" w:line="300"/>
-        <w:jc w:val="both"/>
-      </w:pPr>
-      <w:r>
-        <w:rPr>
-          <w:color w:val="1F2937"/>
-          <w:sz w:val="22"/>
-          <w:szCs w:val="22"/>
-        </w:rPr>
-        <w:t xml:space="preserve">Identifier tous les extrêmes de liquidité visibles sur la zone HTF (BSL/SSL, EQH/EQL, PDH/PDL).</w:t>
-      </w:r>
-    </w:p>
-    <w:p>
-      <w:pPr>
-        <w:pStyle w:val="ListParagraph"/>
-        <w:numPr>
-          <w:ilvl w:val="0"/>
-          <w:numId w:val="2"/>
-        </w:numPr>
-        <w:spacing w:after="120" w:line="300"/>
-        <w:jc w:val="both"/>
-      </w:pPr>
-      <w:r>
-        <w:rPr>
-          <w:color w:val="1F2937"/>
-          <w:sz w:val="22"/>
-          <w:szCs w:val="22"/>
-        </w:rPr>
-        <w:t xml:space="preserve">Qualifier le candidat au DOL global selon cinq critères, seuil minimal 3 sur 5 : ① Standard Deviation (le TP visé se situe entre −2 et −2,5 écarts-types pour un TP1/TP2, jusqu'à −4 pour un Full TP en TP3/TP4) ; ② Ancienneté (le niveau date du Weekly ou du Daily, pas de la séance en cours) ; ③ Densité (plusieurs touches, ou Equal Highs/Lows empilés) ; ④ Virgin level (jamais rebalayé depuis sa formation) ; ⑤ Alignement MTF (visible sur au moins deux timeframes supérieurs).</w:t>
-      </w:r>
-    </w:p>
-    <w:p>
-      <w:pPr>
-        <w:pStyle w:val="ListParagraph"/>
-        <w:numPr>
-          <w:ilvl w:val="0"/>
-          <w:numId w:val="2"/>
-        </w:numPr>
-        <w:spacing w:after="120" w:line="300"/>
-        <w:jc w:val="both"/>
-      </w:pPr>
-      <w:r>
-        <w:rPr>
-          <w:color w:val="1F2937"/>
-          <w:sz w:val="22"/>
-          <w:szCs w:val="22"/>
-        </w:rPr>
-        <w:t xml:space="preserve">Ne considérer la cible comme qualifiée qu'à partir de 3 critères sur 5 remplis ; en dessous, ce n'est pas la vraie cible, c'est probablement l'IDM lui-même — traiter alors tout niveau intermédiaire plus proche comme un IDM candidat.</w:t>
-      </w:r>
-    </w:p>
-    <w:p>
-      <w:pPr>
-        <w:spacing w:after="160"/>
-        <w:jc w:val="both"/>
-      </w:pPr>
-      <w:r>
-        <w:rPr>
-          <w:b/>
-          <w:bCs/>
-          <w:i/>
-          <w:iCs/>
-          <w:color w:val="1F2937"/>
-          <w:sz w:val="22"/>
-          <w:szCs w:val="22"/>
-        </w:rPr>
-        <w:t xml:space="preserve">Lien avec IPF — </w:t>
-      </w:r>
-      <w:r>
-        <w:rPr>
-          <w:i/>
-          <w:iCs/>
-          <w:color w:val="1F2937"/>
-          <w:sz w:val="22"/>
-          <w:szCs w:val="22"/>
-        </w:rPr>
-        <w:t xml:space="preserve">C'est la condition 08 du Verdict (Partie VIII) : le Take Profit doit être posé sur la vraie liquidité HTF, jamais sur l'IDM.</w:t>
-      </w:r>
-    </w:p>
-    <w:p>
-      <w:pPr>
-        <w:pStyle w:val="Heading3"/>
-        <w:keepNext/>
-        <w:keepLines/>
-      </w:pPr>
-      <w:r>
-        <w:t xml:space="preserve">IDM (Inducement) : le niveau qui doit être balayé avant d'entrer</w:t>
-      </w:r>
-    </w:p>
-    <w:p>
-      <w:pPr>
-        <w:keepNext/>
-        <w:keepLines/>
-        <w:spacing w:after="80" w:before="200"/>
-      </w:pPr>
-      <w:r>
-        <w:rPr>
-          <w:b/>
-          <w:bCs/>
-          <w:color w:val="1E3A8A"/>
-          <w:sz w:val="22"/>
-          <w:szCs w:val="22"/>
-        </w:rPr>
-        <w:t xml:space="preserve">IDM — Inducement</w:t>
-      </w:r>
-    </w:p>
-    <w:p>
-      <w:pPr>
-        <w:spacing w:after="160" w:line="300"/>
-        <w:jc w:val="both"/>
-      </w:pPr>
-      <w:r>
-        <w:rPr>
-          <w:b/>
-          <w:bCs/>
-          <w:color w:val="1E3A8A"/>
-          <w:sz w:val="22"/>
-          <w:szCs w:val="22"/>
-        </w:rPr>
-        <w:t xml:space="preserve">Quoi — </w:t>
-      </w:r>
-      <w:r>
-        <w:rPr>
-          <w:color w:val="1F2937"/>
-          <w:sz w:val="22"/>
-          <w:szCs w:val="22"/>
-        </w:rPr>
-        <w:t xml:space="preserve">Le niveau intermédiaire que le marché balaie avant d'atteindre la vraie zone institutionnelle (qualifiée ci-dessus) — sa fonction est de collecter les Stop Loss des particuliers avant que le mouvement réel ne commence.</w:t>
-      </w:r>
-    </w:p>
-    <w:p>
-      <w:pPr>
-        <w:spacing w:after="160" w:line="300"/>
-        <w:jc w:val="both"/>
-      </w:pPr>
-      <w:r>
-        <w:rPr>
-          <w:b/>
-          <w:bCs/>
-          <w:color w:val="B45309"/>
-          <w:sz w:val="22"/>
-          <w:szCs w:val="22"/>
-        </w:rPr>
-        <w:t xml:space="preserve">Pourquoi — </w:t>
-      </w:r>
-      <w:r>
-        <w:rPr>
-          <w:color w:val="1F2937"/>
-          <w:sz w:val="22"/>
-          <w:szCs w:val="22"/>
-        </w:rPr>
-        <w:t xml:space="preserve">Tant que l'IDM n'a pas été pris, aucune entrée n'est légitime : c'est une règle bloquante, pas une préférence. Entrer avant le balayage de l'IDM revient à entrer avant que le « piège » institutionnel décrit en Partie V (MMXM, schéma en 4 phases) ne se soit refermé — c'est-à-dire au moment précis où le marché est le moins prévisible.</w:t>
-      </w:r>
-    </w:p>
-    <w:p>
-      <w:pPr>
-        <w:spacing w:after="160" w:line="300"/>
-        <w:jc w:val="both"/>
-      </w:pPr>
-      <w:r>
-        <w:rPr>
-          <w:b/>
-          <w:bCs/>
-          <w:color w:val="047857"/>
-          <w:sz w:val="22"/>
-          <w:szCs w:val="22"/>
-        </w:rPr>
-        <w:t xml:space="preserve">Comment s'y prendre — </w:t>
-      </w:r>
-      <w:r>
-        <w:rPr>
-          <w:color w:val="1F2937"/>
-          <w:sz w:val="22"/>
-          <w:szCs w:val="22"/>
-        </w:rPr>
-        <w:t xml:space="preserve">Attendre la confirmation explicite que ce niveau intermédiaire a été balayé avant de chercher une entrée — jamais avant, même si la cible (DOL global) est déjà qualifiée à 3/5 ou plus.</w:t>
-      </w:r>
-    </w:p>
-    <w:p>
-      <w:pPr>
-        <w:spacing w:after="160"/>
-        <w:jc w:val="both"/>
-      </w:pPr>
-      <w:r>
-        <w:rPr>
-          <w:b/>
-          <w:bCs/>
-          <w:i/>
-          <w:iCs/>
-          <w:color w:val="1F2937"/>
-          <w:sz w:val="22"/>
-          <w:szCs w:val="22"/>
-        </w:rPr>
-        <w:t xml:space="preserve">Lien avec IPF — </w:t>
-      </w:r>
-      <w:r>
-        <w:rPr>
-          <w:i/>
-          <w:iCs/>
-          <w:color w:val="1F2937"/>
-          <w:sz w:val="22"/>
-          <w:szCs w:val="22"/>
-        </w:rPr>
-        <w:t xml:space="preserve">C'est la condition 03 du Verdict (Partie VIII) : IDM identifié et pris, vraie cible qualifiée à au moins 3/5.</w:t>
-      </w:r>
-    </w:p>
-    <w:p>
-      <w:pPr>
-        <w:keepNext/>
-        <w:keepLines/>
-        <w:pBdr>
-          <w:left w:val="single" w:color="047857" w:sz="24" w:space="8"/>
-        </w:pBdr>
-        <w:shd w:fill="E1F3EC" w:val="clear"/>
-        <w:spacing w:after="60" w:before="200"/>
-      </w:pPr>
-      <w:r>
-        <w:rPr>
-          <w:b/>
-          <w:bCs/>
-          <w:color w:val="047857"/>
-          <w:sz w:val="22"/>
-          <w:szCs w:val="22"/>
-        </w:rPr>
-        <w:t xml:space="preserve">Questions de vérification</w:t>
-      </w:r>
-    </w:p>
-    <w:p>
-      <w:pPr>
-        <w:keepNext/>
-        <w:keepLines/>
-        <w:pBdr>
-          <w:left w:val="single" w:color="047857" w:sz="24" w:space="8"/>
-        </w:pBdr>
-        <w:shd w:fill="E1F3EC" w:val="clear"/>
-        <w:spacing w:after="80" w:line="280"/>
-        <w:jc w:val="both"/>
-      </w:pPr>
-      <w:r>
-        <w:rPr>
-          <w:i/>
-          <w:iCs/>
-          <w:color w:val="1F2937"/>
-          <w:sz w:val="21"/>
-          <w:szCs w:val="21"/>
-        </w:rPr>
-        <w:t xml:space="preserve">• Face à un graphique, saurais-je distinguer, entre deux niveaux de liquidité visibles, lequel est probablement le DOL global et lequel est probablement l'IDM ?</w:t>
-      </w:r>
-    </w:p>
-    <w:p>
-      <w:pPr>
-        <w:keepNext w:val="false"/>
-        <w:keepLines/>
-        <w:pBdr>
-          <w:left w:val="single" w:color="047857" w:sz="24" w:space="8"/>
-        </w:pBdr>
-        <w:shd w:fill="E1F3EC" w:val="clear"/>
-        <w:spacing w:after="200" w:line="280"/>
-        <w:jc w:val="both"/>
-      </w:pPr>
-      <w:r>
-        <w:rPr>
-          <w:i/>
-          <w:iCs/>
-          <w:color w:val="1F2937"/>
-          <w:sz w:val="21"/>
-          <w:szCs w:val="21"/>
-        </w:rPr>
-        <w:t xml:space="preserve">• Est-ce que je comprends pourquoi une entrée prise avant le balayage de l'IDM n'est pas seulement « un peu tôt », mais structurellement prématurée ?</w:t>
-      </w:r>
-    </w:p>
-    <w:p>
-      <w:pPr>
-        <w:pStyle w:val="Heading3"/>
-        <w:keepNext/>
-        <w:keepLines/>
-      </w:pPr>
-      <w:r>
-        <w:t xml:space="preserve">POI : typologie complète des zones d'intérêt</w:t>
-      </w:r>
-    </w:p>
-    <w:p>
-      <w:pPr>
-        <w:spacing w:after="160" w:line="300"/>
-        <w:jc w:val="both"/>
-      </w:pPr>
-      <w:r>
-        <w:rPr>
-          <w:color w:val="1F2937"/>
-          <w:sz w:val="22"/>
-          <w:szCs w:val="22"/>
-        </w:rPr>
-        <w:t xml:space="preserve">Un POI (Point of Interest) est la zone où l'on attend une réaction institutionnelle. Il a toujours deux bornes, jamais un prix unique, et son type doit être déduit du motif réellement visible sur le graphique — jamais choisi par défaut ou par confort.</w:t>
-      </w:r>
-    </w:p>
-    <w:p>
-      <w:pPr>
-        <w:spacing w:after="160" w:line="300"/>
-        <w:jc w:val="both"/>
-      </w:pPr>
-      <w:r>
-        <w:rPr>
-          <w:color w:val="1F2937"/>
-          <w:sz w:val="22"/>
-          <w:szCs w:val="22"/>
-        </w:rPr>
-        <w:t xml:space="preserve">La méthode IPF retient six types canoniques de POI, dans un ordre qui suit leur origine : deux naissent d'une cassure de structure (OB, BB — l'un devant la cassure, l'autre l'ayant traversée puis reprise) ; deux naissent d'un déséquilibre de prix (FVG et son inverse, IFVG) ; un naît d'un épuisement sans cassure (MB) ; le dernier est composite (Unicorn, superposition de deux des précédents). Deux zones complémentaires suivent cette typologie — Rejection Block et BPR — utiles mais en dehors des six types canoniques ; leur statut est précisé dans leur propre bloc.</w:t>
-      </w:r>
-    </w:p>
-    <w:p>
-      <w:pPr>
-        <w:keepNext/>
-        <w:keepLines/>
-        <w:spacing w:after="80" w:before="200"/>
-      </w:pPr>
-      <w:r>
-        <w:rPr>
-          <w:b/>
-          <w:bCs/>
-          <w:color w:val="1E3A8A"/>
-          <w:sz w:val="22"/>
-          <w:szCs w:val="22"/>
-        </w:rPr>
-        <w:t xml:space="preserve">OB (Order Block)</w:t>
-      </w:r>
-    </w:p>
-    <w:p>
-      <w:pPr>
-        <w:spacing w:after="160" w:line="300"/>
-        <w:jc w:val="both"/>
-      </w:pPr>
-      <w:r>
-        <w:rPr>
-          <w:b/>
-          <w:bCs/>
-          <w:color w:val="1E3A8A"/>
-          <w:sz w:val="22"/>
-          <w:szCs w:val="22"/>
-        </w:rPr>
-        <w:t xml:space="preserve">Quoi — </w:t>
-      </w:r>
-      <w:r>
-        <w:rPr>
-          <w:color w:val="1F2937"/>
-          <w:sz w:val="22"/>
-          <w:szCs w:val="22"/>
-        </w:rPr>
-        <w:t xml:space="preserve">La dernière bougie de sens opposé juste avant l'impulsion qui casse la structure. Ses bornes sont exactement le haut et le bas de cette bougie précise.</w:t>
-      </w:r>
-    </w:p>
-    <w:p>
-      <w:pPr>
-        <w:spacing w:after="160" w:line="300"/>
-        <w:jc w:val="both"/>
-      </w:pPr>
-      <w:r>
-        <w:rPr>
-          <w:b/>
-          <w:bCs/>
-          <w:color w:val="B45309"/>
-          <w:sz w:val="22"/>
-          <w:szCs w:val="22"/>
-        </w:rPr>
-        <w:t xml:space="preserve">Pourquoi — </w:t>
-      </w:r>
-      <w:r>
-        <w:rPr>
-          <w:color w:val="1F2937"/>
-          <w:sz w:val="22"/>
-          <w:szCs w:val="22"/>
-        </w:rPr>
-        <w:t xml:space="preserve">Cette bougie est l'endroit où une institution a placé un ordre trop volumineux pour être absorbé sans laisser de trace — le Displacement qui suit en est la preuve.</w:t>
-      </w:r>
-    </w:p>
-    <w:p>
-      <w:pPr>
-        <w:spacing w:after="160" w:line="300"/>
-        <w:jc w:val="both"/>
-      </w:pPr>
-      <w:r>
-        <w:rPr>
-          <w:b/>
-          <w:bCs/>
-          <w:color w:val="047857"/>
-          <w:sz w:val="22"/>
-          <w:szCs w:val="22"/>
-        </w:rPr>
-        <w:t xml:space="preserve">Comment s'y prendre — </w:t>
-      </w:r>
-      <w:r>
-        <w:rPr>
-          <w:color w:val="1F2937"/>
-          <w:sz w:val="22"/>
-          <w:szCs w:val="22"/>
-        </w:rPr>
-        <w:t xml:space="preserve">Repérer l'impulsion qui casse la structure ; remonter à la dernière bougie de sens opposé immédiatement avant cette impulsion ; tracer haut et bas de cette bougie exacte ; vérifier qu'elle n'a jamais été retestée depuis (non mitigée).</w:t>
+        <w:spacing w:after="160" w:line="300"/>
+        <w:jc w:val="both"/>
+      </w:pPr>
+      <w:r>
+        <w:rPr>
+          <w:color w:val="1F2937"/>
+          <w:sz w:val="22"/>
+          <w:szCs w:val="22"/>
+        </w:rPr>
+        <w:t xml:space="preserve">Les deux bornes possibles (High ou Low de la veille) combinées aux deux issues (retournement ou continuation) donnent quatre scénarios nommés : Reversal Haussier (balayage du Low, clôture à l'intérieur), Continuation Baissière (balayage du Low, clôture à l'extérieur), Reversal Baissier (balayage du High, clôture à l'intérieur), et Continuation Haussière (balayage du High, clôture à l'extérieur) — voir Figure 16.</w:t>
       </w:r>
     </w:p>
     <w:p>
@@ -5978,7 +5112,7 @@
       <w:r>
         <w:drawing>
           <wp:inline distT="0" distB="0" distL="0" distR="0">
-            <wp:extent cx="5619750" cy="3590925"/>
+            <wp:extent cx="5619750" cy="4029075"/>
             <wp:effectExtent t="0" r="0" b="0" l="0"/>
             <wp:docPr id="1" name="" descr="" title=""/>
             <wp:cNvGraphicFramePr>
@@ -6003,7 +5137,7 @@
                   <pic:spPr bwMode="auto">
                     <a:xfrm>
                       <a:off x="0" y="0"/>
-                      <a:ext cx="5619750" cy="3590925"/>
+                      <a:ext cx="5619750" cy="4029075"/>
                     </a:xfrm>
                     <a:prstGeom prst="rect">
                       <a:avLst/>
@@ -6029,7 +5163,416 @@
           <w:sz w:val="19"/>
           <w:szCs w:val="19"/>
         </w:rPr>
-        <w:t xml:space="preserve">Figure 9 — L'Order Block : la dernière bougie opposée avant l'impulsion qui casse la structure.</w:t>
+        <w:t xml:space="preserve">Figure 16 — Les quatre scénarios de la Candle Science : le balayage d'un plus haut ou d'un plus bas de la bougie précédente (N-1), puis la clôture qui tranche entre reversal et continuation.</w:t>
+      </w:r>
+    </w:p>
+    <w:p>
+      <w:pPr>
+        <w:pStyle w:val="Heading3"/>
+        <w:keepNext/>
+        <w:keepLines/>
+      </w:pPr>
+      <w:r>
+        <w:t xml:space="preserve">Le narratif du jour</w:t>
+      </w:r>
+    </w:p>
+    <w:p>
+      <w:pPr>
+        <w:spacing w:after="160" w:line="300"/>
+        <w:jc w:val="both"/>
+      </w:pPr>
+      <w:r>
+        <w:rPr>
+          <w:color w:val="1F2937"/>
+          <w:sz w:val="22"/>
+          <w:szCs w:val="22"/>
+        </w:rPr>
+        <w:t xml:space="preserve">Une fois la cascade lue, le DXY et le VIX vérifiés, la phase de marché et la Candle Science établies, tout se résume en une phrase de cadrage — le narratif du jour. Exemple donné par les outils sources : « Le Daily est en expansion haussière, le H4 est en pullback dans cette expansion, et le H1 montre des signes de reprise haussière. » Cette phrase, et elle seule, doit suffire à orienter la recherche de la suite (Étape P) : si elle ne peut pas être formulée sans hésitation, ce n'est pas encore le moment de chercher un POI.</w:t>
+      </w:r>
+    </w:p>
+    <w:p>
+      <w:pPr>
+        <w:spacing w:after="160" w:line="300"/>
+        <w:jc w:val="both"/>
+      </w:pPr>
+      <w:r>
+        <w:rPr>
+          <w:color w:val="1F2937"/>
+          <w:sz w:val="22"/>
+          <w:szCs w:val="22"/>
+        </w:rPr>
+        <w:t xml:space="preserve">Deux derniers filtres, indépendants du narratif mais tout aussi bloquants, doivent malgré tout être vérifiés avant toute action : l'actualité économique, et la fenêtre horaire.</w:t>
+      </w:r>
+    </w:p>
+    <w:p>
+      <w:pPr>
+        <w:pStyle w:val="Heading3"/>
+        <w:keepNext/>
+        <w:keepLines/>
+      </w:pPr>
+      <w:r>
+        <w:t xml:space="preserve">Le filtre fondamental : news et calendrier économique</w:t>
+      </w:r>
+    </w:p>
+    <w:p>
+      <w:pPr>
+        <w:spacing w:after="160" w:line="300"/>
+        <w:jc w:val="both"/>
+      </w:pPr>
+      <w:r>
+        <w:rPr>
+          <w:color w:val="1F2937"/>
+          <w:sz w:val="22"/>
+          <w:szCs w:val="22"/>
+        </w:rPr>
+        <w:t xml:space="preserve">Aucune analyse ni aucun trade ne doit être envisagé si une annonce économique majeure (NFP, CPI, FOMC, ISM, discours de la Présidence de la Fed — signalées par une icône rouge sur Forex Factory ou équivalent) tombe dans les 30 minutes qui suivent. Ce filtre est un blocage, pas un avertissement : la case « calendrier économique consulté » doit être cochée explicitement. L'absence de vérification n'équivaut jamais à un feu vert.</w:t>
+      </w:r>
+    </w:p>
+    <w:p>
+      <w:pPr>
+        <w:pStyle w:val="Heading3"/>
+        <w:keepNext/>
+        <w:keepLines/>
+      </w:pPr>
+      <w:r>
+        <w:t xml:space="preserve">Les Kill Zones : les fenêtres où les institutions agissent réellement</w:t>
+      </w:r>
+    </w:p>
+    <w:p>
+      <w:pPr>
+        <w:spacing w:after="160" w:line="300"/>
+        <w:jc w:val="both"/>
+      </w:pPr>
+      <w:r>
+        <w:rPr>
+          <w:b/>
+          <w:bCs/>
+          <w:color w:val="1E3A8A"/>
+          <w:sz w:val="22"/>
+          <w:szCs w:val="22"/>
+        </w:rPr>
+        <w:t xml:space="preserve">Quoi — </w:t>
+      </w:r>
+      <w:r>
+        <w:rPr>
+          <w:color w:val="1F2937"/>
+          <w:sz w:val="22"/>
+          <w:szCs w:val="22"/>
+        </w:rPr>
+        <w:t xml:space="preserve">Les fenêtres horaires pendant lesquelles le volume institutionnel réel est concentré : Asian 3h00–7h00 UTC, London 7h00–12h00 UTC, NY AM 13h00–17h00 UTC.</w:t>
+      </w:r>
+    </w:p>
+    <w:p>
+      <w:pPr>
+        <w:spacing w:after="160" w:line="300"/>
+        <w:jc w:val="both"/>
+      </w:pPr>
+      <w:r>
+        <w:rPr>
+          <w:b/>
+          <w:bCs/>
+          <w:color w:val="B45309"/>
+          <w:sz w:val="22"/>
+          <w:szCs w:val="22"/>
+        </w:rPr>
+        <w:t xml:space="preserve">Pourquoi — </w:t>
+      </w:r>
+      <w:r>
+        <w:rPr>
+          <w:color w:val="1F2937"/>
+          <w:sz w:val="22"/>
+          <w:szCs w:val="22"/>
+        </w:rPr>
+        <w:t xml:space="preserve">En dehors de ces fenêtres, le marché est piloté par un volume trop faible et trop dispersé pour que la lecture institutionnelle de ce manuel s'applique de façon fiable — hors Kill Zone, on observe, on n'exécute jamais.</w:t>
+      </w:r>
+    </w:p>
+    <w:p>
+      <w:pPr>
+        <w:spacing w:after="160" w:line="300"/>
+        <w:jc w:val="both"/>
+      </w:pPr>
+      <w:r>
+        <w:rPr>
+          <w:b/>
+          <w:bCs/>
+          <w:color w:val="047857"/>
+          <w:sz w:val="22"/>
+          <w:szCs w:val="22"/>
+        </w:rPr>
+        <w:t xml:space="preserve">Comment s'y prendre — </w:t>
+      </w:r>
+      <w:r>
+        <w:rPr>
+          <w:color w:val="1F2937"/>
+          <w:sz w:val="22"/>
+          <w:szCs w:val="22"/>
+        </w:rPr>
+        <w:t xml:space="preserve">Vérifier l'heure UTC actuelle par rapport aux trois fenêtres ci-dessus avant d'envisager la moindre entrée ; noter que l'outil Plan du Jour IPF affiche ces mêmes fenêtres converties dynamiquement en heure de Goma (UTC+2, avec bascule automatique lors du passage à l'heure d'hiver/été américaine, début novembre à mi-mars) — les deux affichages désignent la même fenêtre réelle.</w:t>
+      </w:r>
+    </w:p>
+    <w:p>
+      <w:pPr>
+        <w:spacing w:after="160"/>
+        <w:jc w:val="both"/>
+      </w:pPr>
+      <w:r>
+        <w:rPr>
+          <w:b/>
+          <w:bCs/>
+          <w:i/>
+          <w:iCs/>
+          <w:color w:val="1F2937"/>
+          <w:sz w:val="22"/>
+          <w:szCs w:val="22"/>
+        </w:rPr>
+        <w:t xml:space="preserve">Lien avec IPF — </w:t>
+      </w:r>
+      <w:r>
+        <w:rPr>
+          <w:i/>
+          <w:iCs/>
+          <w:color w:val="1F2937"/>
+          <w:sz w:val="22"/>
+          <w:szCs w:val="22"/>
+        </w:rPr>
+        <w:t xml:space="preserve">C'est la condition 01 du Verdict (Partie VIII) : Kill Zone active, sans quoi toute autre condition devient secondaire.</w:t>
+      </w:r>
+    </w:p>
+    <w:p>
+      <w:pPr>
+        <w:keepNext/>
+        <w:keepLines/>
+        <w:pBdr>
+          <w:left w:val="single" w:color="047857" w:sz="24" w:space="8"/>
+        </w:pBdr>
+        <w:shd w:fill="E1F3EC" w:val="clear"/>
+        <w:spacing w:after="60" w:before="200"/>
+      </w:pPr>
+      <w:r>
+        <w:rPr>
+          <w:b/>
+          <w:bCs/>
+          <w:color w:val="047857"/>
+          <w:sz w:val="22"/>
+          <w:szCs w:val="22"/>
+        </w:rPr>
+        <w:t xml:space="preserve">Questions de vérification</w:t>
+      </w:r>
+    </w:p>
+    <w:p>
+      <w:pPr>
+        <w:keepNext/>
+        <w:keepLines/>
+        <w:pBdr>
+          <w:left w:val="single" w:color="047857" w:sz="24" w:space="8"/>
+        </w:pBdr>
+        <w:shd w:fill="E1F3EC" w:val="clear"/>
+        <w:spacing w:after="80" w:line="280"/>
+        <w:jc w:val="both"/>
+      </w:pPr>
+      <w:r>
+        <w:rPr>
+          <w:i/>
+          <w:iCs/>
+          <w:color w:val="1F2937"/>
+          <w:sz w:val="21"/>
+          <w:szCs w:val="21"/>
+        </w:rPr>
+        <w:t xml:space="preserve">• Est-ce que je peux citer les trois Kill Zones et leurs horaires UTC sans les chercher ?</w:t>
+      </w:r>
+    </w:p>
+    <w:p>
+      <w:pPr>
+        <w:keepNext w:val="false"/>
+        <w:keepLines/>
+        <w:pBdr>
+          <w:left w:val="single" w:color="047857" w:sz="24" w:space="8"/>
+        </w:pBdr>
+        <w:shd w:fill="E1F3EC" w:val="clear"/>
+        <w:spacing w:after="200" w:line="280"/>
+        <w:jc w:val="both"/>
+      </w:pPr>
+      <w:r>
+        <w:rPr>
+          <w:i/>
+          <w:iCs/>
+          <w:color w:val="1F2937"/>
+          <w:sz w:val="21"/>
+          <w:szCs w:val="21"/>
+        </w:rPr>
+        <w:t xml:space="preserve">• Si l'heure de Goma affichée par l'outil ne correspond pas, à première vue, à ce que j'ai mémorisé en UTC, est-ce que je sais pourquoi (bascule hiver/été américaine) plutôt que de m'alarmer ?</w:t>
+      </w:r>
+    </w:p>
+    <w:p>
+      <w:pPr>
+        <w:keepNext/>
+        <w:keepLines/>
+        <w:pBdr>
+          <w:left w:val="single" w:color="047857" w:sz="24" w:space="8"/>
+        </w:pBdr>
+        <w:shd w:fill="E1F3EC" w:val="clear"/>
+        <w:spacing w:after="60" w:before="200"/>
+      </w:pPr>
+      <w:r>
+        <w:rPr>
+          <w:b/>
+          <w:bCs/>
+          <w:color w:val="047857"/>
+          <w:sz w:val="22"/>
+          <w:szCs w:val="22"/>
+        </w:rPr>
+        <w:t xml:space="preserve">Questions de vérification</w:t>
+      </w:r>
+    </w:p>
+    <w:p>
+      <w:pPr>
+        <w:keepNext/>
+        <w:keepLines/>
+        <w:pBdr>
+          <w:left w:val="single" w:color="047857" w:sz="24" w:space="8"/>
+        </w:pBdr>
+        <w:shd w:fill="E1F3EC" w:val="clear"/>
+        <w:spacing w:after="80" w:line="280"/>
+        <w:jc w:val="both"/>
+      </w:pPr>
+      <w:r>
+        <w:rPr>
+          <w:i/>
+          <w:iCs/>
+          <w:color w:val="1F2937"/>
+          <w:sz w:val="21"/>
+          <w:szCs w:val="21"/>
+        </w:rPr>
+        <w:t xml:space="preserve">• Si l'on me demandait de formuler le narratif du jour à partir d'un graphique donné, en une seule phrase et sans notes, saurais-je le faire ?</w:t>
+      </w:r>
+    </w:p>
+    <w:p>
+      <w:pPr>
+        <w:keepNext/>
+        <w:keepLines/>
+        <w:pBdr>
+          <w:left w:val="single" w:color="047857" w:sz="24" w:space="8"/>
+        </w:pBdr>
+        <w:shd w:fill="E1F3EC" w:val="clear"/>
+        <w:spacing w:after="80" w:line="280"/>
+        <w:jc w:val="both"/>
+      </w:pPr>
+      <w:r>
+        <w:rPr>
+          <w:i/>
+          <w:iCs/>
+          <w:color w:val="1F2937"/>
+          <w:sz w:val="21"/>
+          <w:szCs w:val="21"/>
+        </w:rPr>
+        <w:t xml:space="preserve">• Est-ce que je comprends pourquoi une convergence Fragile (DXY et VIX contraires à la lecture technique) doit primer sur un signal technique par ailleurs valide ?</w:t>
+      </w:r>
+    </w:p>
+    <w:p>
+      <w:pPr>
+        <w:keepNext/>
+        <w:keepLines/>
+        <w:pBdr>
+          <w:left w:val="single" w:color="047857" w:sz="24" w:space="8"/>
+        </w:pBdr>
+        <w:shd w:fill="E1F3EC" w:val="clear"/>
+        <w:spacing w:after="80" w:line="280"/>
+        <w:jc w:val="both"/>
+      </w:pPr>
+      <w:r>
+        <w:rPr>
+          <w:i/>
+          <w:iCs/>
+          <w:color w:val="1F2937"/>
+          <w:sz w:val="21"/>
+          <w:szCs w:val="21"/>
+        </w:rPr>
+        <w:t xml:space="preserve">• Est-ce que je peux expliquer pourquoi la Candle Range Theory ne doit jamais être appliquée en dessous du Daily ?</w:t>
+      </w:r>
+    </w:p>
+    <w:p>
+      <w:pPr>
+        <w:keepNext w:val="false"/>
+        <w:keepLines/>
+        <w:pBdr>
+          <w:left w:val="single" w:color="047857" w:sz="24" w:space="8"/>
+        </w:pBdr>
+        <w:shd w:fill="E1F3EC" w:val="clear"/>
+        <w:spacing w:after="200" w:line="280"/>
+        <w:jc w:val="both"/>
+      </w:pPr>
+      <w:r>
+        <w:rPr>
+          <w:i/>
+          <w:iCs/>
+          <w:color w:val="1F2937"/>
+          <w:sz w:val="21"/>
+          <w:szCs w:val="21"/>
+        </w:rPr>
+        <w:t xml:space="preserve">• Est-ce que je sais, pour le style de trading que je pratique, quelle paire de timeframes sert d'ancrage à la règle de biais ?</w:t>
+      </w:r>
+    </w:p>
+    <w:p>
+      <w:r>
+        <w:br w:type="page"/>
+      </w:r>
+    </w:p>
+    <w:p>
+      <w:pPr>
+        <w:pStyle w:val="Heading2"/>
+        <w:keepNext/>
+        <w:keepLines/>
+      </w:pPr>
+      <w:r>
+        <w:t xml:space="preserve">B. Étape P — Price Action &amp; Liquidité</w:t>
+      </w:r>
+    </w:p>
+    <w:p>
+      <w:pPr>
+        <w:spacing w:after="160" w:line="300"/>
+        <w:jc w:val="both"/>
+      </w:pPr>
+      <w:r>
+        <w:rPr>
+          <w:color w:val="1F2937"/>
+          <w:sz w:val="22"/>
+          <w:szCs w:val="22"/>
+        </w:rPr>
+        <w:t xml:space="preserve">Une fois la direction établie (Étape I), l'Étape P répond à la question suivante : où, précisément, le prix est-il susceptible d'aller, et depuis quelle zone institutionnelle peut-il y réagir ? C'est l'étape de la cartographie — celle qui transforme un biais en une zone exploitable.</w:t>
+      </w:r>
+    </w:p>
+    <w:p>
+      <w:pPr>
+        <w:pStyle w:val="Heading3"/>
+        <w:keepNext/>
+        <w:keepLines/>
+      </w:pPr>
+      <w:r>
+        <w:t xml:space="preserve">Le cycle IRL ↔ ERL, appliqué à la sélection de zone</w:t>
+      </w:r>
+    </w:p>
+    <w:p>
+      <w:pPr>
+        <w:spacing w:after="160" w:line="300"/>
+        <w:jc w:val="both"/>
+      </w:pPr>
+      <w:r>
+        <w:rPr>
+          <w:color w:val="1F2937"/>
+          <w:sz w:val="22"/>
+          <w:szCs w:val="22"/>
+        </w:rPr>
+        <w:t xml:space="preserve">Avant toute recherche de zone, il faut situer la position actuelle du prix dans le cycle IRL↔ERL (défini en Partie VII.A) : si le marché est en Expansion (IRL→ERL), la zone d'entrée a déjà été quittée et il faut attendre soit une nouvelle formation, soit le pullback à venir ; si le marché est en Pullback (ERL→IRL), c'est le moment où la recherche de POI a un sens. Chercher un POI pendant une Expansion revient à chercher une porte d'entrée sur un train déjà parti.</w:t>
+      </w:r>
+    </w:p>
+    <w:p>
+      <w:pPr>
+        <w:pStyle w:val="Heading3"/>
+        <w:keepNext/>
+        <w:keepLines/>
+      </w:pPr>
+      <w:r>
+        <w:t xml:space="preserve">DOL : quelle cible viser réellement</w:t>
       </w:r>
     </w:p>
     <w:p>
@@ -6046,7 +5589,7 @@
           <w:sz w:val="22"/>
           <w:szCs w:val="22"/>
         </w:rPr>
-        <w:t xml:space="preserve">FVG (Fair Value Gap) et IFVG (Inverse Fair Value Gap)</w:t>
+        <w:t xml:space="preserve">DOL (Draw On Liquidity) global et immédiat</w:t>
       </w:r>
     </w:p>
     <w:p>
@@ -6070,7 +5613,7 @@
           <w:sz w:val="22"/>
           <w:szCs w:val="22"/>
         </w:rPr>
-        <w:t xml:space="preserve">Le FVG a été défini en Partie V (déséquilibre sur 3 bougies, avec sa règle de Consequent Encroachment à 50 %). L'IFVG est un FVG qui a été entièrement traversé par le prix, et dont le rôle s'inverse : ce qui soutenait la hausse devient une résistance, ou l'inverse.</w:t>
+        <w:t xml:space="preserve">Le DOL est l'attraction du prix vers une poche de liquidité — une destination probable, jamais une garantie. Le DOL global est l'extrême final du range, la vraie cible. Le DOL immédiat est la liquidité la plus proche, et c'est très souvent un simple appât (un IDM) plutôt qu'une vraie destination.</w:t>
       </w:r>
     </w:p>
     <w:p>
@@ -6094,12 +5637,12 @@
           <w:sz w:val="22"/>
           <w:szCs w:val="22"/>
         </w:rPr>
-        <w:t xml:space="preserve">Un FVG traversé n'est pas un FVG annulé : le déséquilibre qu'il représentait a changé de camp, exactement comme un ancien support cassé devient souvent une résistance.</w:t>
-      </w:r>
-    </w:p>
-    <w:p>
-      <w:pPr>
-        <w:spacing w:after="160" w:line="300"/>
+        <w:t xml:space="preserve">Confondre les deux est l'une des erreurs les plus coûteuses de la méthode : viser le DOL immédiat revient à prendre un profit sur l'appât plutôt que sur la vraie cible, et surtout à placer un Take Profit sur un niveau que l'IPDA n'a jamais eu l'intention de respecter comme destination finale.</w:t>
+      </w:r>
+    </w:p>
+    <w:p>
+      <w:pPr>
+        <w:spacing w:after="60"/>
         <w:jc w:val="both"/>
       </w:pPr>
       <w:r>
@@ -6110,6 +5653,182 @@
           <w:sz w:val="22"/>
           <w:szCs w:val="22"/>
         </w:rPr>
+        <w:t xml:space="preserve">Comment s'y prendre —</w:t>
+      </w:r>
+    </w:p>
+    <w:p>
+      <w:pPr>
+        <w:pStyle w:val="ListParagraph"/>
+        <w:numPr>
+          <w:ilvl w:val="0"/>
+          <w:numId w:val="2"/>
+        </w:numPr>
+        <w:spacing w:after="120" w:line="300"/>
+        <w:jc w:val="both"/>
+      </w:pPr>
+      <w:r>
+        <w:rPr>
+          <w:color w:val="1F2937"/>
+          <w:sz w:val="22"/>
+          <w:szCs w:val="22"/>
+        </w:rPr>
+        <w:t xml:space="preserve">Identifier tous les extrêmes de liquidité visibles sur la zone HTF (BSL/SSL, EQH/EQL, PDH/PDL).</w:t>
+      </w:r>
+    </w:p>
+    <w:p>
+      <w:pPr>
+        <w:pStyle w:val="ListParagraph"/>
+        <w:numPr>
+          <w:ilvl w:val="0"/>
+          <w:numId w:val="2"/>
+        </w:numPr>
+        <w:spacing w:after="120" w:line="300"/>
+        <w:jc w:val="both"/>
+      </w:pPr>
+      <w:r>
+        <w:rPr>
+          <w:color w:val="1F2937"/>
+          <w:sz w:val="22"/>
+          <w:szCs w:val="22"/>
+        </w:rPr>
+        <w:t xml:space="preserve">Qualifier le candidat au DOL global selon cinq critères, seuil minimal 3 sur 5 : ① Standard Deviation (le TP visé se situe entre −2 et −2,5 écarts-types pour un TP1/TP2, jusqu'à −4 pour un Full TP en TP3/TP4) ; ② Ancienneté (le niveau date du Weekly ou du Daily, pas de la séance en cours) ; ③ Densité (plusieurs touches, ou Equal Highs/Lows empilés) ; ④ Virgin level (jamais rebalayé depuis sa formation) ; ⑤ Alignement MTF (visible sur au moins deux timeframes supérieurs).</w:t>
+      </w:r>
+    </w:p>
+    <w:p>
+      <w:pPr>
+        <w:pStyle w:val="ListParagraph"/>
+        <w:numPr>
+          <w:ilvl w:val="0"/>
+          <w:numId w:val="2"/>
+        </w:numPr>
+        <w:spacing w:after="120" w:line="300"/>
+        <w:jc w:val="both"/>
+      </w:pPr>
+      <w:r>
+        <w:rPr>
+          <w:color w:val="1F2937"/>
+          <w:sz w:val="22"/>
+          <w:szCs w:val="22"/>
+        </w:rPr>
+        <w:t xml:space="preserve">Ne considérer la cible comme qualifiée qu'à partir de 3 critères sur 5 remplis ; en dessous, ce n'est pas la vraie cible, c'est probablement l'IDM lui-même — traiter alors tout niveau intermédiaire plus proche comme un IDM candidat.</w:t>
+      </w:r>
+    </w:p>
+    <w:p>
+      <w:pPr>
+        <w:spacing w:after="160"/>
+        <w:jc w:val="both"/>
+      </w:pPr>
+      <w:r>
+        <w:rPr>
+          <w:b/>
+          <w:bCs/>
+          <w:i/>
+          <w:iCs/>
+          <w:color w:val="1F2937"/>
+          <w:sz w:val="22"/>
+          <w:szCs w:val="22"/>
+        </w:rPr>
+        <w:t xml:space="preserve">Lien avec IPF — </w:t>
+      </w:r>
+      <w:r>
+        <w:rPr>
+          <w:i/>
+          <w:iCs/>
+          <w:color w:val="1F2937"/>
+          <w:sz w:val="22"/>
+          <w:szCs w:val="22"/>
+        </w:rPr>
+        <w:t xml:space="preserve">C'est la condition 08 du Verdict (Partie VIII) : le Take Profit doit être posé sur la vraie liquidité HTF, jamais sur l'IDM.</w:t>
+      </w:r>
+    </w:p>
+    <w:p>
+      <w:pPr>
+        <w:pStyle w:val="Heading3"/>
+        <w:keepNext/>
+        <w:keepLines/>
+      </w:pPr>
+      <w:r>
+        <w:t xml:space="preserve">IDM (Inducement) : le niveau qui doit être balayé avant d'entrer</w:t>
+      </w:r>
+    </w:p>
+    <w:p>
+      <w:pPr>
+        <w:keepNext/>
+        <w:keepLines/>
+        <w:spacing w:after="80" w:before="200"/>
+      </w:pPr>
+      <w:r>
+        <w:rPr>
+          <w:b/>
+          <w:bCs/>
+          <w:color w:val="1E3A8A"/>
+          <w:sz w:val="22"/>
+          <w:szCs w:val="22"/>
+        </w:rPr>
+        <w:t xml:space="preserve">IDM — Inducement</w:t>
+      </w:r>
+    </w:p>
+    <w:p>
+      <w:pPr>
+        <w:spacing w:after="160" w:line="300"/>
+        <w:jc w:val="both"/>
+      </w:pPr>
+      <w:r>
+        <w:rPr>
+          <w:b/>
+          <w:bCs/>
+          <w:color w:val="1E3A8A"/>
+          <w:sz w:val="22"/>
+          <w:szCs w:val="22"/>
+        </w:rPr>
+        <w:t xml:space="preserve">Quoi — </w:t>
+      </w:r>
+      <w:r>
+        <w:rPr>
+          <w:color w:val="1F2937"/>
+          <w:sz w:val="22"/>
+          <w:szCs w:val="22"/>
+        </w:rPr>
+        <w:t xml:space="preserve">Le niveau intermédiaire que le marché balaie avant d'atteindre la vraie zone institutionnelle (qualifiée ci-dessus) — sa fonction est de collecter les Stop Loss des particuliers avant que le mouvement réel ne commence.</w:t>
+      </w:r>
+    </w:p>
+    <w:p>
+      <w:pPr>
+        <w:spacing w:after="160" w:line="300"/>
+        <w:jc w:val="both"/>
+      </w:pPr>
+      <w:r>
+        <w:rPr>
+          <w:b/>
+          <w:bCs/>
+          <w:color w:val="B45309"/>
+          <w:sz w:val="22"/>
+          <w:szCs w:val="22"/>
+        </w:rPr>
+        <w:t xml:space="preserve">Pourquoi — </w:t>
+      </w:r>
+      <w:r>
+        <w:rPr>
+          <w:color w:val="1F2937"/>
+          <w:sz w:val="22"/>
+          <w:szCs w:val="22"/>
+        </w:rPr>
+        <w:t xml:space="preserve">Tant que l'IDM n'a pas été pris, aucune entrée n'est légitime : c'est une règle bloquante, pas une préférence. Entrer avant le balayage de l'IDM revient à entrer avant que le « piège » institutionnel décrit en Partie V (MMXM, schéma en 4 phases) ne se soit refermé — c'est-à-dire au moment précis où le marché est le moins prévisible.</w:t>
+      </w:r>
+    </w:p>
+    <w:p>
+      <w:pPr>
+        <w:spacing w:after="160" w:line="300"/>
+        <w:jc w:val="both"/>
+      </w:pPr>
+      <w:r>
+        <w:rPr>
+          <w:b/>
+          <w:bCs/>
+          <w:color w:val="047857"/>
+          <w:sz w:val="22"/>
+          <w:szCs w:val="22"/>
+        </w:rPr>
         <w:t xml:space="preserve">Comment s'y prendre — </w:t>
       </w:r>
       <w:r>
@@ -6118,7 +5837,227 @@
           <w:sz w:val="22"/>
           <w:szCs w:val="22"/>
         </w:rPr>
-        <w:t xml:space="preserve">Une fois un FVG intégralement traversé par le prix, le retracer comme zone d'intérêt inversée plutôt que de l'ignorer.</w:t>
+        <w:t xml:space="preserve">Attendre la confirmation explicite que ce niveau intermédiaire a été balayé avant de chercher une entrée — jamais avant, même si la cible (DOL global) est déjà qualifiée à 3/5 ou plus.</w:t>
+      </w:r>
+    </w:p>
+    <w:p>
+      <w:pPr>
+        <w:spacing w:after="160"/>
+        <w:jc w:val="both"/>
+      </w:pPr>
+      <w:r>
+        <w:rPr>
+          <w:b/>
+          <w:bCs/>
+          <w:i/>
+          <w:iCs/>
+          <w:color w:val="1F2937"/>
+          <w:sz w:val="22"/>
+          <w:szCs w:val="22"/>
+        </w:rPr>
+        <w:t xml:space="preserve">Lien avec IPF — </w:t>
+      </w:r>
+      <w:r>
+        <w:rPr>
+          <w:i/>
+          <w:iCs/>
+          <w:color w:val="1F2937"/>
+          <w:sz w:val="22"/>
+          <w:szCs w:val="22"/>
+        </w:rPr>
+        <w:t xml:space="preserve">C'est la condition 03 du Verdict (Partie VIII) : IDM identifié et pris, vraie cible qualifiée à au moins 3/5.</w:t>
+      </w:r>
+    </w:p>
+    <w:p>
+      <w:pPr>
+        <w:keepNext/>
+        <w:keepLines/>
+        <w:pBdr>
+          <w:left w:val="single" w:color="047857" w:sz="24" w:space="8"/>
+        </w:pBdr>
+        <w:shd w:fill="E1F3EC" w:val="clear"/>
+        <w:spacing w:after="60" w:before="200"/>
+      </w:pPr>
+      <w:r>
+        <w:rPr>
+          <w:b/>
+          <w:bCs/>
+          <w:color w:val="047857"/>
+          <w:sz w:val="22"/>
+          <w:szCs w:val="22"/>
+        </w:rPr>
+        <w:t xml:space="preserve">Questions de vérification</w:t>
+      </w:r>
+    </w:p>
+    <w:p>
+      <w:pPr>
+        <w:keepNext/>
+        <w:keepLines/>
+        <w:pBdr>
+          <w:left w:val="single" w:color="047857" w:sz="24" w:space="8"/>
+        </w:pBdr>
+        <w:shd w:fill="E1F3EC" w:val="clear"/>
+        <w:spacing w:after="80" w:line="280"/>
+        <w:jc w:val="both"/>
+      </w:pPr>
+      <w:r>
+        <w:rPr>
+          <w:i/>
+          <w:iCs/>
+          <w:color w:val="1F2937"/>
+          <w:sz w:val="21"/>
+          <w:szCs w:val="21"/>
+        </w:rPr>
+        <w:t xml:space="preserve">• Face à un graphique, saurais-je distinguer, entre deux niveaux de liquidité visibles, lequel est probablement le DOL global et lequel est probablement l'IDM ?</w:t>
+      </w:r>
+    </w:p>
+    <w:p>
+      <w:pPr>
+        <w:keepNext w:val="false"/>
+        <w:keepLines/>
+        <w:pBdr>
+          <w:left w:val="single" w:color="047857" w:sz="24" w:space="8"/>
+        </w:pBdr>
+        <w:shd w:fill="E1F3EC" w:val="clear"/>
+        <w:spacing w:after="200" w:line="280"/>
+        <w:jc w:val="both"/>
+      </w:pPr>
+      <w:r>
+        <w:rPr>
+          <w:i/>
+          <w:iCs/>
+          <w:color w:val="1F2937"/>
+          <w:sz w:val="21"/>
+          <w:szCs w:val="21"/>
+        </w:rPr>
+        <w:t xml:space="preserve">• Est-ce que je comprends pourquoi une entrée prise avant le balayage de l'IDM n'est pas seulement « un peu tôt », mais structurellement prématurée ?</w:t>
+      </w:r>
+    </w:p>
+    <w:p>
+      <w:pPr>
+        <w:pStyle w:val="Heading3"/>
+        <w:keepNext/>
+        <w:keepLines/>
+      </w:pPr>
+      <w:r>
+        <w:t xml:space="preserve">POI : typologie complète des zones d'intérêt</w:t>
+      </w:r>
+    </w:p>
+    <w:p>
+      <w:pPr>
+        <w:spacing w:after="160" w:line="300"/>
+        <w:jc w:val="both"/>
+      </w:pPr>
+      <w:r>
+        <w:rPr>
+          <w:color w:val="1F2937"/>
+          <w:sz w:val="22"/>
+          <w:szCs w:val="22"/>
+        </w:rPr>
+        <w:t xml:space="preserve">Un POI (Point of Interest) est la zone où l'on attend une réaction institutionnelle. Il a toujours deux bornes, jamais un prix unique, et son type doit être déduit du motif réellement visible sur le graphique — jamais choisi par défaut ou par confort.</w:t>
+      </w:r>
+    </w:p>
+    <w:p>
+      <w:pPr>
+        <w:spacing w:after="160" w:line="300"/>
+        <w:jc w:val="both"/>
+      </w:pPr>
+      <w:r>
+        <w:rPr>
+          <w:color w:val="1F2937"/>
+          <w:sz w:val="22"/>
+          <w:szCs w:val="22"/>
+        </w:rPr>
+        <w:t xml:space="preserve">La méthode IPF retient six types canoniques de POI, dans un ordre qui suit leur origine : deux naissent d'une cassure de structure (OB, BB — l'un devant la cassure, l'autre l'ayant traversée puis reprise) ; deux naissent d'un déséquilibre de prix (FVG et son inverse, IFVG) ; un naît d'un épuisement sans cassure (MB) ; le dernier est composite (Unicorn, superposition de deux des précédents). Deux zones complémentaires suivent cette typologie — Rejection Block et BPR — utiles mais en dehors des six types canoniques ; leur statut est précisé dans leur propre bloc.</w:t>
+      </w:r>
+    </w:p>
+    <w:p>
+      <w:pPr>
+        <w:keepNext/>
+        <w:keepLines/>
+        <w:spacing w:after="80" w:before="200"/>
+      </w:pPr>
+      <w:r>
+        <w:rPr>
+          <w:b/>
+          <w:bCs/>
+          <w:color w:val="1E3A8A"/>
+          <w:sz w:val="22"/>
+          <w:szCs w:val="22"/>
+        </w:rPr>
+        <w:t xml:space="preserve">OB (Order Block)</w:t>
+      </w:r>
+    </w:p>
+    <w:p>
+      <w:pPr>
+        <w:spacing w:after="160" w:line="300"/>
+        <w:jc w:val="both"/>
+      </w:pPr>
+      <w:r>
+        <w:rPr>
+          <w:b/>
+          <w:bCs/>
+          <w:color w:val="1E3A8A"/>
+          <w:sz w:val="22"/>
+          <w:szCs w:val="22"/>
+        </w:rPr>
+        <w:t xml:space="preserve">Quoi — </w:t>
+      </w:r>
+      <w:r>
+        <w:rPr>
+          <w:color w:val="1F2937"/>
+          <w:sz w:val="22"/>
+          <w:szCs w:val="22"/>
+        </w:rPr>
+        <w:t xml:space="preserve">La dernière bougie de sens opposé juste avant l'impulsion qui casse la structure. Ses bornes sont exactement le haut et le bas de cette bougie précise.</w:t>
+      </w:r>
+    </w:p>
+    <w:p>
+      <w:pPr>
+        <w:spacing w:after="160" w:line="300"/>
+        <w:jc w:val="both"/>
+      </w:pPr>
+      <w:r>
+        <w:rPr>
+          <w:b/>
+          <w:bCs/>
+          <w:color w:val="B45309"/>
+          <w:sz w:val="22"/>
+          <w:szCs w:val="22"/>
+        </w:rPr>
+        <w:t xml:space="preserve">Pourquoi — </w:t>
+      </w:r>
+      <w:r>
+        <w:rPr>
+          <w:color w:val="1F2937"/>
+          <w:sz w:val="22"/>
+          <w:szCs w:val="22"/>
+        </w:rPr>
+        <w:t xml:space="preserve">Cette bougie est l'endroit où une institution a placé un ordre trop volumineux pour être absorbé sans laisser de trace — le Displacement qui suit en est la preuve.</w:t>
+      </w:r>
+    </w:p>
+    <w:p>
+      <w:pPr>
+        <w:spacing w:after="160" w:line="300"/>
+        <w:jc w:val="both"/>
+      </w:pPr>
+      <w:r>
+        <w:rPr>
+          <w:b/>
+          <w:bCs/>
+          <w:color w:val="047857"/>
+          <w:sz w:val="22"/>
+          <w:szCs w:val="22"/>
+        </w:rPr>
+        <w:t xml:space="preserve">Comment s'y prendre — </w:t>
+      </w:r>
+      <w:r>
+        <w:rPr>
+          <w:color w:val="1F2937"/>
+          <w:sz w:val="22"/>
+          <w:szCs w:val="22"/>
+        </w:rPr>
+        <w:t xml:space="preserve">Repérer l'impulsion qui casse la structure ; remonter à la dernière bougie de sens opposé immédiatement avant cette impulsion ; tracer haut et bas de cette bougie exacte ; vérifier qu'elle n'a jamais été retestée depuis (non mitigée).</w:t>
       </w:r>
     </w:p>
     <w:p>
@@ -6129,7 +6068,7 @@
       <w:r>
         <w:drawing>
           <wp:inline distT="0" distB="0" distL="0" distR="0">
-            <wp:extent cx="5619750" cy="2571750"/>
+            <wp:extent cx="5619750" cy="3590925"/>
             <wp:effectExtent t="0" r="0" b="0" l="0"/>
             <wp:docPr id="1" name="" descr="" title=""/>
             <wp:cNvGraphicFramePr>
@@ -6154,7 +6093,7 @@
                   <pic:spPr bwMode="auto">
                     <a:xfrm>
                       <a:off x="0" y="0"/>
-                      <a:ext cx="5619750" cy="2571750"/>
+                      <a:ext cx="5619750" cy="3590925"/>
                     </a:xfrm>
                     <a:prstGeom prst="rect">
                       <a:avLst/>
@@ -6180,7 +6119,7 @@
           <w:sz w:val="19"/>
           <w:szCs w:val="19"/>
         </w:rPr>
-        <w:t xml:space="preserve">Figure 10 — Du FVG à l'IFVG : une fois intégralement traversé, le vide de prix change de rôle.</w:t>
+        <w:t xml:space="preserve">Figure 9 — L'Order Block : la dernière bougie opposée avant l'impulsion qui casse la structure.</w:t>
       </w:r>
     </w:p>
     <w:p>
@@ -6197,7 +6136,7 @@
           <w:sz w:val="22"/>
           <w:szCs w:val="22"/>
         </w:rPr>
-        <w:t xml:space="preserve">BB (Breaker Block)</w:t>
+        <w:t xml:space="preserve">FVG (Fair Value Gap) et IFVG (Inverse Fair Value Gap)</w:t>
       </w:r>
     </w:p>
     <w:p>
@@ -6221,7 +6160,7 @@
           <w:sz w:val="22"/>
           <w:szCs w:val="22"/>
         </w:rPr>
-        <w:t xml:space="preserve">Un swing dont la structure est réellement cassée par un mouvement violent — un mouvement qui balaie une liquidité identifiable au passage — puis retesté depuis l'autre côté : ce niveau cassé-et-repris devient la nouvelle zone d'intérêt.</w:t>
+        <w:t xml:space="preserve">Le FVG a été défini en Partie V (déséquilibre sur 3 bougies, avec sa règle de Consequent Encroachment à 50 %). L'IFVG est un FVG qui a été entièrement traversé par le prix, et dont le rôle s'inverse : ce qui soutenait la hausse devient une résistance, ou l'inverse.</w:t>
       </w:r>
     </w:p>
     <w:p>
@@ -6245,7 +6184,7 @@
           <w:sz w:val="22"/>
           <w:szCs w:val="22"/>
         </w:rPr>
-        <w:t xml:space="preserve">La cassure elle-même sert d'appât : en apparence, c'est une continuation, et elle crée un Inducement qui pousse les traders retail à suivre ce mouvement — juste avant que l'IPDA n'inverse réellement le cours dans la direction du Market Maker. Le Breaker Block porte donc une double preuve institutionnelle : la violence de la cassure, et le retournement complet qui la dément aussitôt après.</w:t>
+        <w:t xml:space="preserve">Un FVG traversé n'est pas un FVG annulé : le déséquilibre qu'il représentait a changé de camp, exactement comme un ancien support cassé devient souvent une résistance.</w:t>
       </w:r>
     </w:p>
     <w:p>
@@ -6269,7 +6208,7 @@
           <w:sz w:val="22"/>
           <w:szCs w:val="22"/>
         </w:rPr>
-        <w:t xml:space="preserve">Repérer un swing dont la structure est franchement cassée (pas un simple débordement de mèche) ; vérifier que ce mouvement a balayé une liquidité identifiable au passage ; attendre le retour et le retest depuis l'autre côté avant de tracer la zone.</w:t>
+        <w:t xml:space="preserve">Une fois un FVG intégralement traversé par le prix, le retracer comme zone d'intérêt inversée plutôt que de l'ignorer.</w:t>
       </w:r>
     </w:p>
     <w:p>
@@ -6280,7 +6219,7 @@
       <w:r>
         <w:drawing>
           <wp:inline distT="0" distB="0" distL="0" distR="0">
-            <wp:extent cx="5619750" cy="3590925"/>
+            <wp:extent cx="5619750" cy="2571750"/>
             <wp:effectExtent t="0" r="0" b="0" l="0"/>
             <wp:docPr id="1" name="" descr="" title=""/>
             <wp:cNvGraphicFramePr>
@@ -6305,7 +6244,7 @@
                   <pic:spPr bwMode="auto">
                     <a:xfrm>
                       <a:off x="0" y="0"/>
-                      <a:ext cx="5619750" cy="3590925"/>
+                      <a:ext cx="5619750" cy="2571750"/>
                     </a:xfrm>
                     <a:prstGeom prst="rect">
                       <a:avLst/>
@@ -6331,7 +6270,7 @@
           <w:sz w:val="19"/>
           <w:szCs w:val="19"/>
         </w:rPr>
-        <w:t xml:space="preserve">Figure 11 — Le Breaker Block : une cassure de structure qui sert d'abord d'Inducement, avant le retournement réel.</w:t>
+        <w:t xml:space="preserve">Figure 10 — Du FVG à l'IFVG : une fois intégralement traversé, le vide de prix change de rôle.</w:t>
       </w:r>
     </w:p>
     <w:p>
@@ -6348,7 +6287,7 @@
           <w:sz w:val="22"/>
           <w:szCs w:val="22"/>
         </w:rPr>
-        <w:t xml:space="preserve">MB (Mitigation Block)</w:t>
+        <w:t xml:space="preserve">BB (Breaker Block)</w:t>
       </w:r>
     </w:p>
     <w:p>
@@ -6372,7 +6311,7 @@
           <w:sz w:val="22"/>
           <w:szCs w:val="22"/>
         </w:rPr>
-        <w:t xml:space="preserve">Contrairement au Breaker Block, un Mitigation Block ne suppose aucune cassure de structure : c'est une zone d'épuisement — le mouvement s'arrête et s'inverse sans avoir cassé le swing protégé — où une position institutionnelle antérieure vient être soldée.</w:t>
+        <w:t xml:space="preserve">Un swing dont la structure est réellement cassée par un mouvement violent — un mouvement qui balaie une liquidité identifiable au passage — puis retesté depuis l'autre côté : ce niveau cassé-et-repris devient la nouvelle zone d'intérêt.</w:t>
       </w:r>
     </w:p>
     <w:p>
@@ -6396,7 +6335,7 @@
           <w:sz w:val="22"/>
           <w:szCs w:val="22"/>
         </w:rPr>
-        <w:t xml:space="preserve">L'absence de cassure est elle-même le signal : le camp qui menait le mouvement s'essouffle avant même d'avoir validé une continuation, et le camp opposé reprend le contrôle depuis cette zone d'origine. C'est l'application directe de la mécanique de « dette de livraison » décrite en Partie V (section 9) : une institution en perte latente attend ce retour pour clôturer sa position à Break-Even — sans qu'aucune structure n'ait eu besoin d'être cassée pour cela.</w:t>
+        <w:t xml:space="preserve">La cassure elle-même sert d'appât : en apparence, c'est une continuation, et elle crée un Inducement qui pousse les traders retail à suivre ce mouvement — juste avant que l'IPDA n'inverse réellement le cours dans la direction du Market Maker. Le Breaker Block porte donc une double preuve institutionnelle : la violence de la cassure, et le retournement complet qui la dément aussitôt après.</w:t>
       </w:r>
     </w:p>
     <w:p>
@@ -6420,7 +6359,7 @@
           <w:sz w:val="22"/>
           <w:szCs w:val="22"/>
         </w:rPr>
-        <w:t xml:space="preserve">Repérer une zone d'origine d'un mouvement qui s'est essoufflé sans casser le swing protégé, puis qui a fortement divergé du prix ; surveiller son retour comme un Mitigation Block — et vérifier précisément l'absence de cassure de structure, ce qui le distingue du Breaker Block.</w:t>
+        <w:t xml:space="preserve">Repérer un swing dont la structure est franchement cassée (pas un simple débordement de mèche) ; vérifier que ce mouvement a balayé une liquidité identifiable au passage ; attendre le retour et le retest depuis l'autre côté avant de tracer la zone.</w:t>
       </w:r>
     </w:p>
     <w:p>
@@ -6431,7 +6370,7 @@
       <w:r>
         <w:drawing>
           <wp:inline distT="0" distB="0" distL="0" distR="0">
-            <wp:extent cx="5619750" cy="3133725"/>
+            <wp:extent cx="5619750" cy="3590925"/>
             <wp:effectExtent t="0" r="0" b="0" l="0"/>
             <wp:docPr id="1" name="" descr="" title=""/>
             <wp:cNvGraphicFramePr>
@@ -6456,7 +6395,7 @@
                   <pic:spPr bwMode="auto">
                     <a:xfrm>
                       <a:off x="0" y="0"/>
-                      <a:ext cx="5619750" cy="3133725"/>
+                      <a:ext cx="5619750" cy="3590925"/>
                     </a:xfrm>
                     <a:prstGeom prst="rect">
                       <a:avLst/>
@@ -6482,7 +6421,7 @@
           <w:sz w:val="19"/>
           <w:szCs w:val="19"/>
         </w:rPr>
-        <w:t xml:space="preserve">Figure 12 — Le Mitigation Block : le retour, longtemps après, vers la zone d'origine d'une position en perte latente.</w:t>
+        <w:t xml:space="preserve">Figure 11 — Le Breaker Block : une cassure de structure qui sert d'abord d'Inducement, avant le retournement réel.</w:t>
       </w:r>
     </w:p>
     <w:p>
@@ -6499,7 +6438,7 @@
           <w:sz w:val="22"/>
           <w:szCs w:val="22"/>
         </w:rPr>
-        <w:t xml:space="preserve">Rejection Block (zone complémentaire, hors des six types canoniques)</w:t>
+        <w:t xml:space="preserve">MB (Mitigation Block)</w:t>
       </w:r>
     </w:p>
     <w:p>
@@ -6523,7 +6462,7 @@
           <w:sz w:val="22"/>
           <w:szCs w:val="22"/>
         </w:rPr>
-        <w:t xml:space="preserve">Une zone marquée par un rejet net et répété du prix, sans qu'un déséquilibre de type FVG ne s'y forme nécessairement — la mèche, plus que le corps, y porte l'information.</w:t>
+        <w:t xml:space="preserve">Contrairement au Breaker Block, un Mitigation Block ne suppose aucune cassure de structure : c'est une zone d'épuisement — le mouvement s'arrête et s'inverse sans avoir cassé le swing protégé — où une position institutionnelle antérieure vient être soldée.</w:t>
       </w:r>
     </w:p>
     <w:p>
@@ -6547,7 +6486,7 @@
           <w:sz w:val="22"/>
           <w:szCs w:val="22"/>
         </w:rPr>
-        <w:t xml:space="preserve">Un rejet répété au même niveau signale une défense active de ce niveau par un acteur suffisamment important pour absorber plusieurs tentatives. Ce n'est toutefois pas un type de trigger autonome dans la méthode IPF : il s'utilise comme observation qui renforce la lecture d'un des six types canoniques repérés à proximité, jamais comme zone d'entrée à lui seul.</w:t>
+        <w:t xml:space="preserve">L'absence de cassure est elle-même le signal : le camp qui menait le mouvement s'essouffle avant même d'avoir validé une continuation, et le camp opposé reprend le contrôle depuis cette zone d'origine. C'est l'application directe de la mécanique de « dette de livraison » décrite en Partie V (section 9) : une institution en perte latente attend ce retour pour clôturer sa position à Break-Even — sans qu'aucune structure n'ait eu besoin d'être cassée pour cela.</w:t>
       </w:r>
     </w:p>
     <w:p>
@@ -6571,213 +6510,7 @@
           <w:sz w:val="22"/>
           <w:szCs w:val="22"/>
         </w:rPr>
-        <w:t xml:space="preserve">Repérer un niveau où plusieurs mèches, sur plusieurs bougies, rejettent le prix dans la même direction sans que le corps ne progresse ; tracer la zone couverte par ces mèches, et s'en servir pour renforcer — jamais remplacer — la qualification d'un OB, BB ou MB voisin.</w:t>
-      </w:r>
-    </w:p>
-    <w:p>
-      <w:pPr>
-        <w:keepNext/>
-        <w:keepLines/>
-        <w:spacing w:after="80" w:before="200"/>
-      </w:pPr>
-      <w:r>
-        <w:rPr>
-          <w:b/>
-          <w:bCs/>
-          <w:color w:val="1E3A8A"/>
-          <w:sz w:val="22"/>
-          <w:szCs w:val="22"/>
-        </w:rPr>
-        <w:t xml:space="preserve">PD Array</w:t>
-      </w:r>
-    </w:p>
-    <w:p>
-      <w:pPr>
-        <w:spacing w:after="160" w:line="300"/>
-        <w:jc w:val="both"/>
-      </w:pPr>
-      <w:r>
-        <w:rPr>
-          <w:b/>
-          <w:bCs/>
-          <w:color w:val="1E3A8A"/>
-          <w:sz w:val="22"/>
-          <w:szCs w:val="22"/>
-        </w:rPr>
-        <w:t xml:space="preserve">Quoi — </w:t>
-      </w:r>
-      <w:r>
-        <w:rPr>
-          <w:color w:val="1F2937"/>
-          <w:sz w:val="22"/>
-          <w:szCs w:val="22"/>
-        </w:rPr>
-        <w:t xml:space="preserve">Le terme générique qui regroupe l'ensemble des niveaux de référence institutionnels utilisés par la grille de lecture IPDA pour l'exécution — Order Block, FVG, IFVG, Breaker Block, Mitigation Block, niveaux de liquidité (BSL/SSL, EQH/EQL), et niveaux de Fibonacci (Premium/Discount, OTE).</w:t>
-      </w:r>
-    </w:p>
-    <w:p>
-      <w:pPr>
-        <w:spacing w:after="160" w:line="300"/>
-        <w:jc w:val="both"/>
-      </w:pPr>
-      <w:r>
-        <w:rPr>
-          <w:b/>
-          <w:bCs/>
-          <w:color w:val="B45309"/>
-          <w:sz w:val="22"/>
-          <w:szCs w:val="22"/>
-        </w:rPr>
-        <w:t xml:space="preserve">Pourquoi — </w:t>
-      </w:r>
-      <w:r>
-        <w:rPr>
-          <w:color w:val="1F2937"/>
-          <w:sz w:val="22"/>
-          <w:szCs w:val="22"/>
-        </w:rPr>
-        <w:t xml:space="preserve">Aucun de ces éléments ne fonctionne isolément comme prédicteur : le PD Array est la grille complète dans laquelle chaque type de zone prend son sens, en fonction de sa position dans le Range HTF et de la liquidité qui l'entoure.</w:t>
-      </w:r>
-    </w:p>
-    <w:p>
-      <w:pPr>
-        <w:spacing w:after="160" w:line="300"/>
-        <w:jc w:val="both"/>
-      </w:pPr>
-      <w:r>
-        <w:rPr>
-          <w:b/>
-          <w:bCs/>
-          <w:color w:val="047857"/>
-          <w:sz w:val="22"/>
-          <w:szCs w:val="22"/>
-        </w:rPr>
-        <w:t xml:space="preserve">Comment s'y prendre — </w:t>
-      </w:r>
-      <w:r>
-        <w:rPr>
-          <w:color w:val="1F2937"/>
-          <w:sz w:val="22"/>
-          <w:szCs w:val="22"/>
-        </w:rPr>
-        <w:t xml:space="preserve">Face à un graphique, dresser mentalement la liste des PD Arrays visibles (chaque OB, FVG, niveau de liquidité) avant de choisir lequel qualifier comme POI candidat — ne jamais s'arrêter au premier repéré.</w:t>
-      </w:r>
-    </w:p>
-    <w:p>
-      <w:pPr>
-        <w:keepNext/>
-        <w:keepLines/>
-        <w:spacing w:after="80" w:before="200"/>
-      </w:pPr>
-      <w:r>
-        <w:rPr>
-          <w:b/>
-          <w:bCs/>
-          <w:color w:val="1E3A8A"/>
-          <w:sz w:val="22"/>
-          <w:szCs w:val="22"/>
-        </w:rPr>
-        <w:t xml:space="preserve">Unicorn Model</w:t>
-      </w:r>
-    </w:p>
-    <w:p>
-      <w:pPr>
-        <w:spacing w:after="160" w:line="300"/>
-        <w:jc w:val="both"/>
-      </w:pPr>
-      <w:r>
-        <w:rPr>
-          <w:b/>
-          <w:bCs/>
-          <w:color w:val="1E3A8A"/>
-          <w:sz w:val="22"/>
-          <w:szCs w:val="22"/>
-        </w:rPr>
-        <w:t xml:space="preserve">Quoi — </w:t>
-      </w:r>
-      <w:r>
-        <w:rPr>
-          <w:color w:val="1F2937"/>
-          <w:sz w:val="22"/>
-          <w:szCs w:val="22"/>
-        </w:rPr>
-        <w:t xml:space="preserve">La superposition d'un Breaker Block et d'un FVG au même niveau — une confluence rare qui exige une preuve sur un timeframe inférieur, jamais un choix par confort.</w:t>
-      </w:r>
-    </w:p>
-    <w:p>
-      <w:pPr>
-        <w:spacing w:after="160" w:line="300"/>
-        <w:jc w:val="both"/>
-      </w:pPr>
-      <w:r>
-        <w:rPr>
-          <w:b/>
-          <w:bCs/>
-          <w:color w:val="B45309"/>
-          <w:sz w:val="22"/>
-          <w:szCs w:val="22"/>
-        </w:rPr>
-        <w:t xml:space="preserve">Pourquoi — </w:t>
-      </w:r>
-      <w:r>
-        <w:rPr>
-          <w:color w:val="1F2937"/>
-          <w:sz w:val="22"/>
-          <w:szCs w:val="22"/>
-        </w:rPr>
-        <w:t xml:space="preserve">Quand un Breaker Block et un FVG coïncident, deux preuves institutionnelles indépendantes pointent vers la même zone : la cassure-piège du Breaker Block (Inducement retail suivi du vrai retournement de l'IPDA) et le déséquilibre laissé par l'impulsion qui a produit le FVG. C'est cette double confirmation qui rend le Unicorn Model plus puissant qu'une zone simple.</w:t>
-      </w:r>
-    </w:p>
-    <w:p>
-      <w:pPr>
-        <w:spacing w:after="160" w:line="300"/>
-        <w:jc w:val="both"/>
-      </w:pPr>
-      <w:r>
-        <w:rPr>
-          <w:b/>
-          <w:bCs/>
-          <w:color w:val="047857"/>
-          <w:sz w:val="22"/>
-          <w:szCs w:val="22"/>
-        </w:rPr>
-        <w:t xml:space="preserve">Comment s'y prendre — </w:t>
-      </w:r>
-      <w:r>
-        <w:rPr>
-          <w:color w:val="1F2937"/>
-          <w:sz w:val="22"/>
-          <w:szCs w:val="22"/>
-        </w:rPr>
-        <w:t xml:space="preserve">Ne retenir un Unicorn que lorsque les deux zones (Breaker Block et FVG) se chevauchent réellement sur le graphique, jamais quand elles sont seulement proches l'une de l'autre.</w:t>
-      </w:r>
-    </w:p>
-    <w:p>
-      <w:pPr>
-        <w:spacing w:after="160"/>
-        <w:jc w:val="both"/>
-      </w:pPr>
-      <w:r>
-        <w:rPr>
-          <w:b/>
-          <w:bCs/>
-          <w:i/>
-          <w:iCs/>
-          <w:color w:val="1F2937"/>
-          <w:sz w:val="22"/>
-          <w:szCs w:val="22"/>
-        </w:rPr>
-        <w:t xml:space="preserve">Lien avec IPF — </w:t>
-      </w:r>
-      <w:r>
-        <w:rPr>
-          <w:i/>
-          <w:iCs/>
-          <w:color w:val="1F2937"/>
-          <w:sz w:val="22"/>
-          <w:szCs w:val="22"/>
-        </w:rPr>
-        <w:t xml:space="preserve">C'est le Modèle d'entrée 5 de la taxonomie canonique détaillée en Partie VII.C.</w:t>
+        <w:t xml:space="preserve">Repérer une zone d'origine d'un mouvement qui s'est essoufflé sans casser le swing protégé, puis qui a fortement divergé du prix ; surveiller son retour comme un Mitigation Block — et vérifier précisément l'absence de cassure de structure, ce qui le distingue du Breaker Block.</w:t>
       </w:r>
     </w:p>
     <w:p>
@@ -6788,7 +6521,7 @@
       <w:r>
         <w:drawing>
           <wp:inline distT="0" distB="0" distL="0" distR="0">
-            <wp:extent cx="5619750" cy="3819525"/>
+            <wp:extent cx="5619750" cy="3133725"/>
             <wp:effectExtent t="0" r="0" b="0" l="0"/>
             <wp:docPr id="1" name="" descr="" title=""/>
             <wp:cNvGraphicFramePr>
@@ -6813,7 +6546,7 @@
                   <pic:spPr bwMode="auto">
                     <a:xfrm>
                       <a:off x="0" y="0"/>
-                      <a:ext cx="5619750" cy="3819525"/>
+                      <a:ext cx="5619750" cy="3133725"/>
                     </a:xfrm>
                     <a:prstGeom prst="rect">
                       <a:avLst/>
@@ -6839,23 +6572,14 @@
           <w:sz w:val="19"/>
           <w:szCs w:val="19"/>
         </w:rPr>
-        <w:t xml:space="preserve">Figure 13 — Le Unicorn Model : Breaker Block et FVG superposés au même niveau.</w:t>
-      </w:r>
-    </w:p>
-    <w:p>
-      <w:pPr>
-        <w:pStyle w:val="Heading3"/>
-        <w:keepNext/>
-        <w:keepLines/>
-      </w:pPr>
-      <w:r>
-        <w:t xml:space="preserve">Grille de qualification du POI : seuil 4 sur 6, un critère obligatoire</w:t>
-      </w:r>
-    </w:p>
-    <w:p>
-      <w:pPr>
-        <w:spacing w:after="160" w:line="300"/>
-        <w:jc w:val="both"/>
+        <w:t xml:space="preserve">Figure 12 — Le Mitigation Block : le retour, longtemps après, vers la zone d'origine d'une position en perte latente.</w:t>
+      </w:r>
+    </w:p>
+    <w:p>
+      <w:pPr>
+        <w:keepNext/>
+        <w:keepLines/>
+        <w:spacing w:after="80" w:before="200"/>
       </w:pPr>
       <w:r>
         <w:rPr>
@@ -6865,6 +6589,22 @@
           <w:sz w:val="22"/>
           <w:szCs w:val="22"/>
         </w:rPr>
+        <w:t xml:space="preserve">Rejection Block (zone complémentaire, hors des six types canoniques)</w:t>
+      </w:r>
+    </w:p>
+    <w:p>
+      <w:pPr>
+        <w:spacing w:after="160" w:line="300"/>
+        <w:jc w:val="both"/>
+      </w:pPr>
+      <w:r>
+        <w:rPr>
+          <w:b/>
+          <w:bCs/>
+          <w:color w:val="1E3A8A"/>
+          <w:sz w:val="22"/>
+          <w:szCs w:val="22"/>
+        </w:rPr>
         <w:t xml:space="preserve">Quoi — </w:t>
       </w:r>
       <w:r>
@@ -6873,7 +6613,7 @@
           <w:sz w:val="22"/>
           <w:szCs w:val="22"/>
         </w:rPr>
-        <w:t xml:space="preserve">Six critères qualifient un POI candidat : ① Ancienneté (formé sur Weekly ou Daily, pas sur une bougie LTF isolée) ; ② Densité (plusieurs réactions antérieures, ou recoupement avec un Equal High/Low) ; ③ Intouchabilité (jamais retesté depuis sa formation — la vraie définition de « non mitigé ») ; ④ Alignement MTF (confirmé sur au moins deux timeframes supérieurs à celui du trigger) ; ⑤ Proportion (assez éloigné du dernier swing pour une réaction institutionnelle, pas 2-3 points de bruit) ; ⑥ Liquidité adjacente, critère obligatoire (la zone se situe juste au-dessus ou en dessous d'un pool de liquidité nommable, que le prix balaie en premier avant d'y réagir).</w:t>
+        <w:t xml:space="preserve">Une zone marquée par un rejet net et répété du prix, sans qu'un déséquilibre de type FVG ne s'y forme nécessairement — la mèche, plus que le corps, y porte l'information.</w:t>
       </w:r>
     </w:p>
     <w:p>
@@ -6897,7 +6637,7 @@
           <w:sz w:val="22"/>
           <w:szCs w:val="22"/>
         </w:rPr>
-        <w:t xml:space="preserve">Le seuil global (4 critères sur 6) ne suffit pas seul : le critère ⑥ est une condition supplémentaire et non négociable, parce qu'un POI sans liquidité adjacente nommable n'a aucune raison structurelle d'attirer une réaction institutionnelle, quel que soit le score obtenu sur les cinq autres critères.</w:t>
+        <w:t xml:space="preserve">Un rejet répété au même niveau signale une défense active de ce niveau par un acteur suffisamment important pour absorber plusieurs tentatives. Ce n'est toutefois pas un type de trigger autonome dans la méthode IPF : il s'utilise comme observation qui renforce la lecture d'un des six types canoniques repérés à proximité, jamais comme zone d'entrée à lui seul.</w:t>
       </w:r>
     </w:p>
     <w:p>
@@ -6921,7 +6661,185 @@
           <w:sz w:val="22"/>
           <w:szCs w:val="22"/>
         </w:rPr>
-        <w:t xml:space="preserve">Évaluer les six critères un par un sur le POI candidat ; ne le qualifier que si au moins quatre sont remplis et si le critère ⑥ (liquidité adjacente) l'est également, sans exception.</w:t>
+        <w:t xml:space="preserve">Repérer un niveau où plusieurs mèches, sur plusieurs bougies, rejettent le prix dans la même direction sans que le corps ne progresse ; tracer la zone couverte par ces mèches, et s'en servir pour renforcer — jamais remplacer — la qualification d'un OB, BB ou MB voisin.</w:t>
+      </w:r>
+    </w:p>
+    <w:p>
+      <w:pPr>
+        <w:keepNext/>
+        <w:keepLines/>
+        <w:spacing w:after="80" w:before="200"/>
+      </w:pPr>
+      <w:r>
+        <w:rPr>
+          <w:b/>
+          <w:bCs/>
+          <w:color w:val="1E3A8A"/>
+          <w:sz w:val="22"/>
+          <w:szCs w:val="22"/>
+        </w:rPr>
+        <w:t xml:space="preserve">PD Array</w:t>
+      </w:r>
+    </w:p>
+    <w:p>
+      <w:pPr>
+        <w:spacing w:after="160" w:line="300"/>
+        <w:jc w:val="both"/>
+      </w:pPr>
+      <w:r>
+        <w:rPr>
+          <w:b/>
+          <w:bCs/>
+          <w:color w:val="1E3A8A"/>
+          <w:sz w:val="22"/>
+          <w:szCs w:val="22"/>
+        </w:rPr>
+        <w:t xml:space="preserve">Quoi — </w:t>
+      </w:r>
+      <w:r>
+        <w:rPr>
+          <w:color w:val="1F2937"/>
+          <w:sz w:val="22"/>
+          <w:szCs w:val="22"/>
+        </w:rPr>
+        <w:t xml:space="preserve">Le terme générique qui regroupe l'ensemble des niveaux de référence institutionnels utilisés par la grille de lecture IPDA pour l'exécution — Order Block, FVG, IFVG, Breaker Block, Mitigation Block, niveaux de liquidité (BSL/SSL, EQH/EQL), et niveaux de Fibonacci (Premium/Discount, OTE).</w:t>
+      </w:r>
+    </w:p>
+    <w:p>
+      <w:pPr>
+        <w:spacing w:after="160" w:line="300"/>
+        <w:jc w:val="both"/>
+      </w:pPr>
+      <w:r>
+        <w:rPr>
+          <w:b/>
+          <w:bCs/>
+          <w:color w:val="B45309"/>
+          <w:sz w:val="22"/>
+          <w:szCs w:val="22"/>
+        </w:rPr>
+        <w:t xml:space="preserve">Pourquoi — </w:t>
+      </w:r>
+      <w:r>
+        <w:rPr>
+          <w:color w:val="1F2937"/>
+          <w:sz w:val="22"/>
+          <w:szCs w:val="22"/>
+        </w:rPr>
+        <w:t xml:space="preserve">Aucun de ces éléments ne fonctionne isolément comme prédicteur : le PD Array est la grille complète dans laquelle chaque type de zone prend son sens, en fonction de sa position dans le Range HTF et de la liquidité qui l'entoure.</w:t>
+      </w:r>
+    </w:p>
+    <w:p>
+      <w:pPr>
+        <w:spacing w:after="160" w:line="300"/>
+        <w:jc w:val="both"/>
+      </w:pPr>
+      <w:r>
+        <w:rPr>
+          <w:b/>
+          <w:bCs/>
+          <w:color w:val="047857"/>
+          <w:sz w:val="22"/>
+          <w:szCs w:val="22"/>
+        </w:rPr>
+        <w:t xml:space="preserve">Comment s'y prendre — </w:t>
+      </w:r>
+      <w:r>
+        <w:rPr>
+          <w:color w:val="1F2937"/>
+          <w:sz w:val="22"/>
+          <w:szCs w:val="22"/>
+        </w:rPr>
+        <w:t xml:space="preserve">Face à un graphique, dresser mentalement la liste des PD Arrays visibles (chaque OB, FVG, niveau de liquidité) avant de choisir lequel qualifier comme POI candidat — ne jamais s'arrêter au premier repéré.</w:t>
+      </w:r>
+    </w:p>
+    <w:p>
+      <w:pPr>
+        <w:keepNext/>
+        <w:keepLines/>
+        <w:spacing w:after="80" w:before="200"/>
+      </w:pPr>
+      <w:r>
+        <w:rPr>
+          <w:b/>
+          <w:bCs/>
+          <w:color w:val="1E3A8A"/>
+          <w:sz w:val="22"/>
+          <w:szCs w:val="22"/>
+        </w:rPr>
+        <w:t xml:space="preserve">Unicorn Model</w:t>
+      </w:r>
+    </w:p>
+    <w:p>
+      <w:pPr>
+        <w:spacing w:after="160" w:line="300"/>
+        <w:jc w:val="both"/>
+      </w:pPr>
+      <w:r>
+        <w:rPr>
+          <w:b/>
+          <w:bCs/>
+          <w:color w:val="1E3A8A"/>
+          <w:sz w:val="22"/>
+          <w:szCs w:val="22"/>
+        </w:rPr>
+        <w:t xml:space="preserve">Quoi — </w:t>
+      </w:r>
+      <w:r>
+        <w:rPr>
+          <w:color w:val="1F2937"/>
+          <w:sz w:val="22"/>
+          <w:szCs w:val="22"/>
+        </w:rPr>
+        <w:t xml:space="preserve">La superposition d'un Breaker Block et d'un FVG au même niveau — une confluence rare qui exige une preuve sur un timeframe inférieur, jamais un choix par confort.</w:t>
+      </w:r>
+    </w:p>
+    <w:p>
+      <w:pPr>
+        <w:spacing w:after="160" w:line="300"/>
+        <w:jc w:val="both"/>
+      </w:pPr>
+      <w:r>
+        <w:rPr>
+          <w:b/>
+          <w:bCs/>
+          <w:color w:val="B45309"/>
+          <w:sz w:val="22"/>
+          <w:szCs w:val="22"/>
+        </w:rPr>
+        <w:t xml:space="preserve">Pourquoi — </w:t>
+      </w:r>
+      <w:r>
+        <w:rPr>
+          <w:color w:val="1F2937"/>
+          <w:sz w:val="22"/>
+          <w:szCs w:val="22"/>
+        </w:rPr>
+        <w:t xml:space="preserve">Quand un Breaker Block et un FVG coïncident, deux preuves institutionnelles indépendantes pointent vers la même zone : la cassure-piège du Breaker Block (Inducement retail suivi du vrai retournement de l'IPDA) et le déséquilibre laissé par l'impulsion qui a produit le FVG. C'est cette double confirmation qui rend le Unicorn Model plus puissant qu'une zone simple.</w:t>
+      </w:r>
+    </w:p>
+    <w:p>
+      <w:pPr>
+        <w:spacing w:after="160" w:line="300"/>
+        <w:jc w:val="both"/>
+      </w:pPr>
+      <w:r>
+        <w:rPr>
+          <w:b/>
+          <w:bCs/>
+          <w:color w:val="047857"/>
+          <w:sz w:val="22"/>
+          <w:szCs w:val="22"/>
+        </w:rPr>
+        <w:t xml:space="preserve">Comment s'y prendre — </w:t>
+      </w:r>
+      <w:r>
+        <w:rPr>
+          <w:color w:val="1F2937"/>
+          <w:sz w:val="22"/>
+          <w:szCs w:val="22"/>
+        </w:rPr>
+        <w:t xml:space="preserve">Ne retenir un Unicorn que lorsque les deux zones (Breaker Block et FVG) se chevauchent réellement sur le graphique, jamais quand elles sont seulement proches l'une de l'autre.</w:t>
       </w:r>
     </w:p>
     <w:p>
@@ -6949,308 +6867,7 @@
           <w:sz w:val="22"/>
           <w:szCs w:val="22"/>
         </w:rPr>
-        <w:t xml:space="preserve">C'est la condition 04 du Verdict (Partie VIII) : POI qualifié, zone Premium/Discount cohérente, retour filtré.</w:t>
-      </w:r>
-    </w:p>
-    <w:p>
-      <w:pPr>
-        <w:pStyle w:val="Heading3"/>
-        <w:keepNext/>
-        <w:keepLines/>
-      </w:pPr>
-      <w:r>
-        <w:t xml:space="preserve">Grille complémentaire : 8 confluences et classification Tier</w:t>
-      </w:r>
-    </w:p>
-    <w:p>
-      <w:pPr>
-        <w:spacing w:after="160" w:line="300"/>
-        <w:jc w:val="both"/>
-      </w:pPr>
-      <w:r>
-        <w:rPr>
-          <w:b/>
-          <w:bCs/>
-          <w:color w:val="1E3A8A"/>
-          <w:sz w:val="22"/>
-          <w:szCs w:val="22"/>
-        </w:rPr>
-        <w:t xml:space="preserve">Quoi — </w:t>
-      </w:r>
-      <w:r>
-        <w:rPr>
-          <w:color w:val="1F2937"/>
-          <w:sz w:val="22"/>
-          <w:szCs w:val="22"/>
-        </w:rPr>
-        <w:t xml:space="preserve">Une grille de lecture rapide, complémentaire à la grille à 6 critères ci-dessus, qui compte le nombre de confluences alignées sur une même zone parmi huit : FVG, Order Block, position Premium/Discount, liquidité à proximité, structure de marché favorable, ChoCH attendu ou confirmé, session de trading pertinente, alignement H4/H1/M15. Le compte obtenu classe le POI en Tier S (exceptionnel), Tier 1 (fort), Tier 2 (moyen) ou Tier 3 (faible mais acceptable).</w:t>
-      </w:r>
-    </w:p>
-    <w:p>
-      <w:pPr>
-        <w:spacing w:after="160" w:line="300"/>
-        <w:jc w:val="both"/>
-      </w:pPr>
-      <w:r>
-        <w:rPr>
-          <w:b/>
-          <w:bCs/>
-          <w:color w:val="B45309"/>
-          <w:sz w:val="22"/>
-          <w:szCs w:val="22"/>
-        </w:rPr>
-        <w:t xml:space="preserve">Pourquoi — </w:t>
-      </w:r>
-      <w:r>
-        <w:rPr>
-          <w:color w:val="1F2937"/>
-          <w:sz w:val="22"/>
-          <w:szCs w:val="22"/>
-        </w:rPr>
-        <w:t xml:space="preserve">Cette grille ne remplace jamais la grille à 6 critères — elle offre une lecture d'ensemble, plus rapide à l'œil, utile pour comparer plusieurs zones candidates entre elles avant d'appliquer l'analyse complète à la plus prometteuse.</w:t>
-      </w:r>
-    </w:p>
-    <w:p>
-      <w:pPr>
-        <w:spacing w:after="160" w:line="300"/>
-        <w:jc w:val="both"/>
-      </w:pPr>
-      <w:r>
-        <w:rPr>
-          <w:b/>
-          <w:bCs/>
-          <w:color w:val="047857"/>
-          <w:sz w:val="22"/>
-          <w:szCs w:val="22"/>
-        </w:rPr>
-        <w:t xml:space="preserve">Comment s'y prendre — </w:t>
-      </w:r>
-      <w:r>
-        <w:rPr>
-          <w:color w:val="1F2937"/>
-          <w:sz w:val="22"/>
-          <w:szCs w:val="22"/>
-        </w:rPr>
-        <w:t xml:space="preserve">Compter, pour chaque zone candidate, combien des huit confluences sont réellement observables ; classer en Tier S/1/2/3 pour prioriser laquelle analyser en détail avec la grille à 6 critères.</w:t>
-      </w:r>
-    </w:p>
-    <w:p>
-      <w:pPr>
-        <w:pStyle w:val="Heading3"/>
-        <w:keepNext/>
-        <w:keepLines/>
-      </w:pPr>
-      <w:r>
-        <w:t xml:space="preserve">Premium / Discount appliqué au POI</w:t>
-      </w:r>
-    </w:p>
-    <w:p>
-      <w:pPr>
-        <w:spacing w:after="160" w:line="300"/>
-        <w:jc w:val="both"/>
-      </w:pPr>
-      <w:r>
-        <w:rPr>
-          <w:color w:val="1F2937"/>
-          <w:sz w:val="22"/>
-          <w:szCs w:val="22"/>
-        </w:rPr>
-        <w:t xml:space="preserve">Une fois un POI qualifié, sa cohérence directionnelle doit être vérifiée : un POI d'achat doit se situer en zone Discount (moins de 50 % du range ancré), un POI de vente en zone Premium (plus de 50 %). Un POI par ailleurs valide mais situé dans la mauvaise moitié du range est traité comme un blocage, pas comme un simple avertissement — voir Partie V, section 3.</w:t>
-      </w:r>
-    </w:p>
-    <w:p>
-      <w:pPr>
-        <w:pStyle w:val="Heading3"/>
-        <w:keepNext/>
-        <w:keepLines/>
-      </w:pPr>
-      <w:r>
-        <w:t xml:space="preserve">Liquidité adjacente nommable et schéma AMD</w:t>
-      </w:r>
-    </w:p>
-    <w:p>
-      <w:pPr>
-        <w:keepNext/>
-        <w:keepLines/>
-        <w:spacing w:after="80" w:before="200"/>
-      </w:pPr>
-      <w:r>
-        <w:rPr>
-          <w:b/>
-          <w:bCs/>
-          <w:color w:val="1E3A8A"/>
-          <w:sz w:val="22"/>
-          <w:szCs w:val="22"/>
-        </w:rPr>
-        <w:t xml:space="preserve">EQH/EQL, PDH/PDL, Round Number, Trendline liquidity</w:t>
-      </w:r>
-    </w:p>
-    <w:p>
-      <w:pPr>
-        <w:spacing w:after="160" w:line="300"/>
-        <w:jc w:val="both"/>
-      </w:pPr>
-      <w:r>
-        <w:rPr>
-          <w:b/>
-          <w:bCs/>
-          <w:color w:val="1E3A8A"/>
-          <w:sz w:val="22"/>
-          <w:szCs w:val="22"/>
-        </w:rPr>
-        <w:t xml:space="preserve">Quoi — </w:t>
-      </w:r>
-      <w:r>
-        <w:rPr>
-          <w:color w:val="1F2937"/>
-          <w:sz w:val="22"/>
-          <w:szCs w:val="22"/>
-        </w:rPr>
-        <w:t xml:space="preserve">Les quatre formes les plus courantes de liquidité adjacente nommable exigée par le critère ⑥ ci-dessus : EQH/EQL (Equal Highs/Lows — plusieurs sommets ou creux au même niveau, signalant une accumulation de stops), PDH/PDL (Previous Day High/Low — bornes d'ancrage fréquentes en Daily), Round Number (niveau psychologique rond), Trendline liquidity (liquidité accumulée le long d'une ligne de tendance évidente).</w:t>
-      </w:r>
-    </w:p>
-    <w:p>
-      <w:pPr>
-        <w:spacing w:after="160" w:line="300"/>
-        <w:jc w:val="both"/>
-      </w:pPr>
-      <w:r>
-        <w:rPr>
-          <w:b/>
-          <w:bCs/>
-          <w:color w:val="B45309"/>
-          <w:sz w:val="22"/>
-          <w:szCs w:val="22"/>
-        </w:rPr>
-        <w:t xml:space="preserve">Pourquoi — </w:t>
-      </w:r>
-      <w:r>
-        <w:rPr>
-          <w:color w:val="1F2937"/>
-          <w:sz w:val="22"/>
-          <w:szCs w:val="22"/>
-        </w:rPr>
-        <w:t xml:space="preserve">Ces quatre formes sont les endroits où l'enseignement classique du trading pousse le plus grand nombre de particuliers à placer leurs ordres — elles sont donc, presque par définition, les réservoirs de contrepartie les plus fiables pour une institution.</w:t>
-      </w:r>
-    </w:p>
-    <w:p>
-      <w:pPr>
-        <w:spacing w:after="160" w:line="300"/>
-        <w:jc w:val="both"/>
-      </w:pPr>
-      <w:r>
-        <w:rPr>
-          <w:b/>
-          <w:bCs/>
-          <w:color w:val="047857"/>
-          <w:sz w:val="22"/>
-          <w:szCs w:val="22"/>
-        </w:rPr>
-        <w:t xml:space="preserve">Comment s'y prendre — </w:t>
-      </w:r>
-      <w:r>
-        <w:rPr>
-          <w:color w:val="1F2937"/>
-          <w:sz w:val="22"/>
-          <w:szCs w:val="22"/>
-        </w:rPr>
-        <w:t xml:space="preserve">Avant de valider le critère ⑥ d'un POI, identifier explicitement laquelle de ces quatre formes se trouve juste à côté de la zone, et dans quel sens le prix devrait la balayer en premier.</w:t>
-      </w:r>
-    </w:p>
-    <w:p>
-      <w:pPr>
-        <w:spacing w:after="160" w:line="300"/>
-        <w:jc w:val="both"/>
-      </w:pPr>
-      <w:r>
-        <w:rPr>
-          <w:color w:val="1F2937"/>
-          <w:sz w:val="22"/>
-          <w:szCs w:val="22"/>
-        </w:rPr>
-        <w:t xml:space="preserve">Le schéma AMD (introduit en Partie II) trouve ici son application concrète : le POI se situe presque toujours juste au-delà d'une liquidité nommable — un Equal High/Low, un haut ou un bas de session, ou une zone d'Inducement — que le prix balaie en premier avant de revenir y réagir.</w:t>
-      </w:r>
-    </w:p>
-    <w:p>
-      <w:pPr>
-        <w:pStyle w:val="Heading3"/>
-        <w:keepNext/>
-        <w:keepLines/>
-      </w:pPr>
-      <w:r>
-        <w:t xml:space="preserve">BPR — Balanced Price Range (zone spécialisée, hors des six types canoniques)</w:t>
-      </w:r>
-    </w:p>
-    <w:p>
-      <w:pPr>
-        <w:spacing w:after="160" w:line="300"/>
-        <w:jc w:val="both"/>
-      </w:pPr>
-      <w:r>
-        <w:rPr>
-          <w:b/>
-          <w:bCs/>
-          <w:color w:val="1E3A8A"/>
-          <w:sz w:val="22"/>
-          <w:szCs w:val="22"/>
-        </w:rPr>
-        <w:t xml:space="preserve">Quoi — </w:t>
-      </w:r>
-      <w:r>
-        <w:rPr>
-          <w:color w:val="1F2937"/>
-          <w:sz w:val="22"/>
-          <w:szCs w:val="22"/>
-        </w:rPr>
-        <w:t xml:space="preserve">La zone de chevauchement exact entre un Fair Value Gap haussier et un Fair Value Gap baissier formés au même niveau — un espace où le prix a laissé, dans les deux sens, un déséquilibre non comblé.</w:t>
-      </w:r>
-    </w:p>
-    <w:p>
-      <w:pPr>
-        <w:spacing w:after="160" w:line="300"/>
-        <w:jc w:val="both"/>
-      </w:pPr>
-      <w:r>
-        <w:rPr>
-          <w:b/>
-          <w:bCs/>
-          <w:color w:val="B45309"/>
-          <w:sz w:val="22"/>
-          <w:szCs w:val="22"/>
-        </w:rPr>
-        <w:t xml:space="preserve">Pourquoi — </w:t>
-      </w:r>
-      <w:r>
-        <w:rPr>
-          <w:color w:val="1F2937"/>
-          <w:sz w:val="22"/>
-          <w:szCs w:val="22"/>
-        </w:rPr>
-        <w:t xml:space="preserve">Cette double origine rend le BPR particulièrement dense en information : deux mouvements impulsifs, dans deux directions différentes, y ont chacun laissé une dette de livraison. Ce n'est pas un septième type de POI générique : c'est une zone spécialisée, réservée au Modèle d'entrée 2 (Sweep + BPR, Partie VII.C), et à lui seul.</w:t>
-      </w:r>
-    </w:p>
-    <w:p>
-      <w:pPr>
-        <w:spacing w:after="160" w:line="300"/>
-        <w:jc w:val="both"/>
-      </w:pPr>
-      <w:r>
-        <w:rPr>
-          <w:b/>
-          <w:bCs/>
-          <w:color w:val="047857"/>
-          <w:sz w:val="22"/>
-          <w:szCs w:val="22"/>
-        </w:rPr>
-        <w:t xml:space="preserve">Comment s'y prendre — </w:t>
-      </w:r>
-      <w:r>
-        <w:rPr>
-          <w:color w:val="1F2937"/>
-          <w:sz w:val="22"/>
-          <w:szCs w:val="22"/>
-        </w:rPr>
-        <w:t xml:space="preserve">Repérer deux FVG de sens opposés qui se chevauchent sur la même plage de prix ; tracer la zone commune aux deux comme BPR.</w:t>
+        <w:t xml:space="preserve">C'est le Modèle d'entrée 5 de la taxonomie canonique détaillée en Partie VII.C.</w:t>
       </w:r>
     </w:p>
     <w:p>
@@ -7312,7 +6929,7 @@
           <w:sz w:val="19"/>
           <w:szCs w:val="19"/>
         </w:rPr>
-        <w:t xml:space="preserve">Figure 14 — Le BPR : la zone commune à un FVG haussier et un FVG baissier formés au même niveau.</w:t>
+        <w:t xml:space="preserve">Figure 13 — Le Unicorn Model : Breaker Block et FVG superposés au même niveau.</w:t>
       </w:r>
     </w:p>
     <w:p>
@@ -7322,32 +6939,61 @@
         <w:keepLines/>
       </w:pPr>
       <w:r>
-        <w:t xml:space="preserve">Judas Swing et Dealing Range, appliqués à la sélection de zone</w:t>
-      </w:r>
-    </w:p>
-    <w:p>
-      <w:pPr>
-        <w:spacing w:after="160" w:line="300"/>
-        <w:jc w:val="both"/>
-      </w:pPr>
-      <w:r>
-        <w:rPr>
-          <w:color w:val="1F2937"/>
-          <w:sz w:val="22"/>
-          <w:szCs w:val="22"/>
-        </w:rPr>
-        <w:t xml:space="preserve">Le Judas Swing (défini en Partie V comme la phase de Manipulation du cycle MMXM) trouve ici son utilité pratique directe : le mouvement de manipulation qui balaie la liquidité d'un côté du Dealing Range (l'autre nom, utilisé par certaines ressources, pour désigner le Range HTF ou le couloir d'Accumulation asiatique) est précisément ce qui doit être identifié avant de considérer la zone opposée comme un POI valide. Confirmer qu'un Judas Swing a eu lieu, c'est confirmer que le « piège » institutionnel est refermé — condition nécessaire, mais non suffisante seule, avant de chercher une entrée.</w:t>
-      </w:r>
-    </w:p>
-    <w:p>
-      <w:pPr>
-        <w:keepNext/>
-        <w:keepLines/>
-        <w:pBdr>
-          <w:left w:val="single" w:color="047857" w:sz="24" w:space="8"/>
-        </w:pBdr>
-        <w:shd w:fill="E1F3EC" w:val="clear"/>
-        <w:spacing w:after="60" w:before="200"/>
+        <w:t xml:space="preserve">Grille de qualification du POI : seuil 4 sur 6, un critère obligatoire</w:t>
+      </w:r>
+    </w:p>
+    <w:p>
+      <w:pPr>
+        <w:spacing w:after="160" w:line="300"/>
+        <w:jc w:val="both"/>
+      </w:pPr>
+      <w:r>
+        <w:rPr>
+          <w:b/>
+          <w:bCs/>
+          <w:color w:val="1E3A8A"/>
+          <w:sz w:val="22"/>
+          <w:szCs w:val="22"/>
+        </w:rPr>
+        <w:t xml:space="preserve">Quoi — </w:t>
+      </w:r>
+      <w:r>
+        <w:rPr>
+          <w:color w:val="1F2937"/>
+          <w:sz w:val="22"/>
+          <w:szCs w:val="22"/>
+        </w:rPr>
+        <w:t xml:space="preserve">Six critères qualifient un POI candidat : ① Ancienneté (formé sur Weekly ou Daily, pas sur une bougie LTF isolée) ; ② Densité (plusieurs réactions antérieures, ou recoupement avec un Equal High/Low) ; ③ Intouchabilité (jamais retesté depuis sa formation — la vraie définition de « non mitigé ») ; ④ Alignement MTF (confirmé sur au moins deux timeframes supérieurs à celui du trigger) ; ⑤ Proportion (assez éloigné du dernier swing pour une réaction institutionnelle, pas 2-3 points de bruit) ; ⑥ Liquidité adjacente, critère obligatoire (la zone se situe juste au-dessus ou en dessous d'un pool de liquidité nommable, que le prix balaie en premier avant d'y réagir).</w:t>
+      </w:r>
+    </w:p>
+    <w:p>
+      <w:pPr>
+        <w:spacing w:after="160" w:line="300"/>
+        <w:jc w:val="both"/>
+      </w:pPr>
+      <w:r>
+        <w:rPr>
+          <w:b/>
+          <w:bCs/>
+          <w:color w:val="B45309"/>
+          <w:sz w:val="22"/>
+          <w:szCs w:val="22"/>
+        </w:rPr>
+        <w:t xml:space="preserve">Pourquoi — </w:t>
+      </w:r>
+      <w:r>
+        <w:rPr>
+          <w:color w:val="1F2937"/>
+          <w:sz w:val="22"/>
+          <w:szCs w:val="22"/>
+        </w:rPr>
+        <w:t xml:space="preserve">Le seuil global (4 critères sur 6) ne suffit pas seul : le critère ⑥ est une condition supplémentaire et non négociable, parce qu'un POI sans liquidité adjacente nommable n'a aucune raison structurelle d'attirer une réaction institutionnelle, quel que soit le score obtenu sur les cinq autres critères.</w:t>
+      </w:r>
+    </w:p>
+    <w:p>
+      <w:pPr>
+        <w:spacing w:after="160" w:line="300"/>
+        <w:jc w:val="both"/>
       </w:pPr>
       <w:r>
         <w:rPr>
@@ -7357,124 +7003,43 @@
           <w:sz w:val="22"/>
           <w:szCs w:val="22"/>
         </w:rPr>
-        <w:t xml:space="preserve">Questions de vérification</w:t>
-      </w:r>
-    </w:p>
-    <w:p>
-      <w:pPr>
-        <w:keepNext/>
-        <w:keepLines/>
-        <w:pBdr>
-          <w:left w:val="single" w:color="047857" w:sz="24" w:space="8"/>
-        </w:pBdr>
-        <w:shd w:fill="E1F3EC" w:val="clear"/>
-        <w:spacing w:after="80" w:line="280"/>
-        <w:jc w:val="both"/>
-      </w:pPr>
-      <w:r>
-        <w:rPr>
+        <w:t xml:space="preserve">Comment s'y prendre — </w:t>
+      </w:r>
+      <w:r>
+        <w:rPr>
+          <w:color w:val="1F2937"/>
+          <w:sz w:val="22"/>
+          <w:szCs w:val="22"/>
+        </w:rPr>
+        <w:t xml:space="preserve">Évaluer les six critères un par un sur le POI candidat ; ne le qualifier que si au moins quatre sont remplis et si le critère ⑥ (liquidité adjacente) l'est également, sans exception.</w:t>
+      </w:r>
+    </w:p>
+    <w:p>
+      <w:pPr>
+        <w:spacing w:after="160"/>
+        <w:jc w:val="both"/>
+      </w:pPr>
+      <w:r>
+        <w:rPr>
+          <w:b/>
+          <w:bCs/>
           <w:i/>
           <w:iCs/>
           <w:color w:val="1F2937"/>
-          <w:sz w:val="21"/>
-          <w:szCs w:val="21"/>
-        </w:rPr>
-        <w:t xml:space="preserve">• Face à deux niveaux de liquidité sur un même graphique, saurais-je justifier lequel est probablement le DOL global et lequel est un IDM, à partir des cinq critères de qualification — pas d'une impression ?</w:t>
-      </w:r>
-    </w:p>
-    <w:p>
-      <w:pPr>
-        <w:keepNext/>
-        <w:keepLines/>
-        <w:pBdr>
-          <w:left w:val="single" w:color="047857" w:sz="24" w:space="8"/>
-        </w:pBdr>
-        <w:shd w:fill="E1F3EC" w:val="clear"/>
-        <w:spacing w:after="80" w:line="280"/>
-        <w:jc w:val="both"/>
-      </w:pPr>
+          <w:sz w:val="22"/>
+          <w:szCs w:val="22"/>
+        </w:rPr>
+        <w:t xml:space="preserve">Lien avec IPF — </w:t>
+      </w:r>
       <w:r>
         <w:rPr>
           <w:i/>
           <w:iCs/>
           <w:color w:val="1F2937"/>
-          <w:sz w:val="21"/>
-          <w:szCs w:val="21"/>
-        </w:rPr>
-        <w:t xml:space="preserve">• Est-ce que je peux nommer, sans les confondre, les six types de POI de la méthode IPF et donner un trait distinctif de chacun ?</w:t>
-      </w:r>
-    </w:p>
-    <w:p>
-      <w:pPr>
-        <w:keepNext/>
-        <w:keepLines/>
-        <w:pBdr>
-          <w:left w:val="single" w:color="047857" w:sz="24" w:space="8"/>
-        </w:pBdr>
-        <w:shd w:fill="E1F3EC" w:val="clear"/>
-        <w:spacing w:after="80" w:line="280"/>
-        <w:jc w:val="both"/>
-      </w:pPr>
-      <w:r>
-        <w:rPr>
-          <w:i/>
-          <w:iCs/>
-          <w:color w:val="1F2937"/>
-          <w:sz w:val="21"/>
-          <w:szCs w:val="21"/>
-        </w:rPr>
-        <w:t xml:space="preserve">• Face à un POI qui obtient un bon score sur cinq critères mais qui échoue sur le critère ⑥ (liquidité adjacente), est-ce que je sais que ce POI doit être rejeté malgré tout ?</w:t>
-      </w:r>
-    </w:p>
-    <w:p>
-      <w:pPr>
-        <w:keepNext w:val="false"/>
-        <w:keepLines/>
-        <w:pBdr>
-          <w:left w:val="single" w:color="047857" w:sz="24" w:space="8"/>
-        </w:pBdr>
-        <w:shd w:fill="E1F3EC" w:val="clear"/>
-        <w:spacing w:after="200" w:line="280"/>
-        <w:jc w:val="both"/>
-      </w:pPr>
-      <w:r>
-        <w:rPr>
-          <w:i/>
-          <w:iCs/>
-          <w:color w:val="1F2937"/>
-          <w:sz w:val="21"/>
-          <w:szCs w:val="21"/>
-        </w:rPr>
-        <w:t xml:space="preserve">• Est-ce que je comprends la différence entre la grille à 6 critères (qualification stricte) et la grille à 8 confluences/Tier (comparaison rapide entre zones candidates) ?</w:t>
-      </w:r>
-    </w:p>
-    <w:p>
-      <w:r>
-        <w:br w:type="page"/>
-      </w:r>
-    </w:p>
-    <w:p>
-      <w:pPr>
-        <w:pStyle w:val="Heading2"/>
-        <w:keepNext/>
-        <w:keepLines/>
-      </w:pPr>
-      <w:r>
-        <w:t xml:space="preserve">C. Étape F — Fractal Model &amp; Exécution LTF</w:t>
-      </w:r>
-    </w:p>
-    <w:p>
-      <w:pPr>
-        <w:spacing w:after="160" w:line="300"/>
-        <w:jc w:val="both"/>
-      </w:pPr>
-      <w:r>
-        <w:rPr>
-          <w:color w:val="1F2937"/>
-          <w:sz w:val="22"/>
-          <w:szCs w:val="22"/>
-        </w:rPr>
-        <w:t xml:space="preserve">Un biais correct (Étape I) et une zone qualifiée (Étape P) ne suffisent pas encore à autoriser une entrée. L'Étape F répond à la dernière question : sur le timeframe d'exécution, quelle confirmation précise atteste que la réaction attendue est réellement en train de se produire ?</w:t>
+          <w:sz w:val="22"/>
+          <w:szCs w:val="22"/>
+        </w:rPr>
+        <w:t xml:space="preserve">C'est la condition 04 du Verdict (Partie VIII) : POI qualifié, zone Premium/Discount cohérente, retour filtré.</w:t>
       </w:r>
     </w:p>
     <w:p>
@@ -7484,7 +7049,113 @@
         <w:keepLines/>
       </w:pPr>
       <w:r>
-        <w:t xml:space="preserve">BOS et ChoCH — une distinction qui ne souffre aucune exception</w:t>
+        <w:t xml:space="preserve">Grille complémentaire : 8 confluences et classification Tier</w:t>
+      </w:r>
+    </w:p>
+    <w:p>
+      <w:pPr>
+        <w:spacing w:after="160" w:line="300"/>
+        <w:jc w:val="both"/>
+      </w:pPr>
+      <w:r>
+        <w:rPr>
+          <w:b/>
+          <w:bCs/>
+          <w:color w:val="1E3A8A"/>
+          <w:sz w:val="22"/>
+          <w:szCs w:val="22"/>
+        </w:rPr>
+        <w:t xml:space="preserve">Quoi — </w:t>
+      </w:r>
+      <w:r>
+        <w:rPr>
+          <w:color w:val="1F2937"/>
+          <w:sz w:val="22"/>
+          <w:szCs w:val="22"/>
+        </w:rPr>
+        <w:t xml:space="preserve">Une grille de lecture rapide, complémentaire à la grille à 6 critères ci-dessus, qui compte le nombre de confluences alignées sur une même zone parmi huit : FVG, Order Block, position Premium/Discount, liquidité à proximité, structure de marché favorable, ChoCH attendu ou confirmé, session de trading pertinente, alignement H4/H1/M15. Le compte obtenu classe le POI en Tier S (exceptionnel), Tier 1 (fort), Tier 2 (moyen) ou Tier 3 (faible mais acceptable).</w:t>
+      </w:r>
+    </w:p>
+    <w:p>
+      <w:pPr>
+        <w:spacing w:after="160" w:line="300"/>
+        <w:jc w:val="both"/>
+      </w:pPr>
+      <w:r>
+        <w:rPr>
+          <w:b/>
+          <w:bCs/>
+          <w:color w:val="B45309"/>
+          <w:sz w:val="22"/>
+          <w:szCs w:val="22"/>
+        </w:rPr>
+        <w:t xml:space="preserve">Pourquoi — </w:t>
+      </w:r>
+      <w:r>
+        <w:rPr>
+          <w:color w:val="1F2937"/>
+          <w:sz w:val="22"/>
+          <w:szCs w:val="22"/>
+        </w:rPr>
+        <w:t xml:space="preserve">Cette grille ne remplace jamais la grille à 6 critères — elle offre une lecture d'ensemble, plus rapide à l'œil, utile pour comparer plusieurs zones candidates entre elles avant d'appliquer l'analyse complète à la plus prometteuse.</w:t>
+      </w:r>
+    </w:p>
+    <w:p>
+      <w:pPr>
+        <w:spacing w:after="160" w:line="300"/>
+        <w:jc w:val="both"/>
+      </w:pPr>
+      <w:r>
+        <w:rPr>
+          <w:b/>
+          <w:bCs/>
+          <w:color w:val="047857"/>
+          <w:sz w:val="22"/>
+          <w:szCs w:val="22"/>
+        </w:rPr>
+        <w:t xml:space="preserve">Comment s'y prendre — </w:t>
+      </w:r>
+      <w:r>
+        <w:rPr>
+          <w:color w:val="1F2937"/>
+          <w:sz w:val="22"/>
+          <w:szCs w:val="22"/>
+        </w:rPr>
+        <w:t xml:space="preserve">Compter, pour chaque zone candidate, combien des huit confluences sont réellement observables ; classer en Tier S/1/2/3 pour prioriser laquelle analyser en détail avec la grille à 6 critères.</w:t>
+      </w:r>
+    </w:p>
+    <w:p>
+      <w:pPr>
+        <w:pStyle w:val="Heading3"/>
+        <w:keepNext/>
+        <w:keepLines/>
+      </w:pPr>
+      <w:r>
+        <w:t xml:space="preserve">Premium / Discount appliqué au POI</w:t>
+      </w:r>
+    </w:p>
+    <w:p>
+      <w:pPr>
+        <w:spacing w:after="160" w:line="300"/>
+        <w:jc w:val="both"/>
+      </w:pPr>
+      <w:r>
+        <w:rPr>
+          <w:color w:val="1F2937"/>
+          <w:sz w:val="22"/>
+          <w:szCs w:val="22"/>
+        </w:rPr>
+        <w:t xml:space="preserve">Une fois un POI qualifié, sa cohérence directionnelle doit être vérifiée : un POI d'achat doit se situer en zone Discount (moins de 50 % du range ancré), un POI de vente en zone Premium (plus de 50 %). Un POI par ailleurs valide mais situé dans la mauvaise moitié du range est traité comme un blocage, pas comme un simple avertissement — voir Partie V, section 3.</w:t>
+      </w:r>
+    </w:p>
+    <w:p>
+      <w:pPr>
+        <w:pStyle w:val="Heading3"/>
+        <w:keepNext/>
+        <w:keepLines/>
+      </w:pPr>
+      <w:r>
+        <w:t xml:space="preserve">Liquidité adjacente nommable et schéma AMD</w:t>
       </w:r>
     </w:p>
     <w:p>
@@ -7501,7 +7172,7 @@
           <w:sz w:val="22"/>
           <w:szCs w:val="22"/>
         </w:rPr>
-        <w:t xml:space="preserve">BOS (Break of Structure) et ChoCH (Change of Character)</w:t>
+        <w:t xml:space="preserve">EQH/EQL, PDH/PDL, Round Number, Trendline liquidity</w:t>
       </w:r>
     </w:p>
     <w:p>
@@ -7525,7 +7196,7 @@
           <w:sz w:val="22"/>
           <w:szCs w:val="22"/>
         </w:rPr>
-        <w:t xml:space="preserve">Le BOS confirme une continuation dans le sens de la tendance déjà en cours : un nouveau sommet (ou creux) qui dépasse le précédent, dans le même sens que la structure établie. Le ChoCH est le premier signe structurel qu'un retournement de contrôle a eu lieu sur le timeframe d'exécution : un plus haut qui échoue à dépasser le précédent dans un marché haussier (ou l'inverse), suivi d'une cassure dans le sens opposé.</w:t>
+        <w:t xml:space="preserve">Les quatre formes les plus courantes de liquidité adjacente nommable exigée par le critère ⑥ ci-dessus : EQH/EQL (Equal Highs/Lows — plusieurs sommets ou creux au même niveau, signalant une accumulation de stops), PDH/PDL (Previous Day High/Low — bornes d'ancrage fréquentes en Daily), Round Number (niveau psychologique rond), Trendline liquidity (liquidité accumulée le long d'une ligne de tendance évidente).</w:t>
       </w:r>
     </w:p>
     <w:p>
@@ -7549,7 +7220,7 @@
           <w:sz w:val="22"/>
           <w:szCs w:val="22"/>
         </w:rPr>
-        <w:t xml:space="preserve">Le BOS et le ChoCH ne mesurent pas la même chose : confondre les deux revient à confondre « la tendance continue » et « la tendance vient de s'inverser » — une erreur qui, à l'échelle de l'exécution, transforme une entrée de continuation en une entrée de retournement sans que le trader s'en rende compte.</w:t>
+        <w:t xml:space="preserve">Ces quatre formes sont les endroits où l'enseignement classique du trading pousse le plus grand nombre de particuliers à placer leurs ordres — elles sont donc, presque par définition, les réservoirs de contrepartie les plus fiables pour une institution.</w:t>
       </w:r>
     </w:p>
     <w:p>
@@ -7573,49 +7244,103 @@
           <w:sz w:val="22"/>
           <w:szCs w:val="22"/>
         </w:rPr>
-        <w:t xml:space="preserve">Sur le timeframe d'exécution, identifier si le nouveau swing prolonge la structure précédente (BOS) ou la contredit pour la première fois (ChoCH) ; ne valider un ChoCH qu'à la clôture de la bougie qui le confirme — un ChoCH en cours de bougie n'existe pas, il peut être annulé avant la fermeture.</w:t>
-      </w:r>
-    </w:p>
-    <w:p>
-      <w:pPr>
-        <w:spacing w:after="160"/>
-        <w:jc w:val="both"/>
-      </w:pPr>
-      <w:r>
-        <w:rPr>
-          <w:b/>
-          <w:bCs/>
-          <w:i/>
-          <w:iCs/>
-          <w:color w:val="1F2937"/>
-          <w:sz w:val="22"/>
-          <w:szCs w:val="22"/>
-        </w:rPr>
-        <w:t xml:space="preserve">Lien avec IPF — </w:t>
-      </w:r>
-      <w:r>
-        <w:rPr>
-          <w:i/>
-          <w:iCs/>
-          <w:color w:val="1F2937"/>
-          <w:sz w:val="22"/>
-          <w:szCs w:val="22"/>
-        </w:rPr>
-        <w:t xml:space="preserve">C'est la condition 05 du Verdict (Partie VIII), qui exige spécifiquement un ChoCH confirmé — jamais un simple BOS — avant d'envisager une entrée.</w:t>
-      </w:r>
-    </w:p>
-    <w:p>
-      <w:pPr>
-        <w:spacing w:after="160" w:line="300"/>
-        <w:jc w:val="both"/>
-      </w:pPr>
-      <w:r>
-        <w:rPr>
-          <w:color w:val="1F2937"/>
-          <w:sz w:val="22"/>
-          <w:szCs w:val="22"/>
-        </w:rPr>
-        <w:t xml:space="preserve">Note de correspondance terminologique : certaines ressources — notamment le document de référence interne « Détails étape par étape » et la fiche de terrain A4 de BK-BOOST Ltd. — utilisent le terme MSS (Market Structure Shift) à la place, ou aux côtés, de ChoCH. Ce manuel fait le choix délibéré de ne retenir qu'un seul terme, ChoCH, pour désigner ce retournement de contrôle, afin d'éliminer toute ambiguïté : partout où vous croiserez « MSS » dans un autre document de BK-BOOST Ltd., lisez ChoCH.</w:t>
+        <w:t xml:space="preserve">Avant de valider le critère ⑥ d'un POI, identifier explicitement laquelle de ces quatre formes se trouve juste à côté de la zone, et dans quel sens le prix devrait la balayer en premier.</w:t>
+      </w:r>
+    </w:p>
+    <w:p>
+      <w:pPr>
+        <w:spacing w:after="160" w:line="300"/>
+        <w:jc w:val="both"/>
+      </w:pPr>
+      <w:r>
+        <w:rPr>
+          <w:color w:val="1F2937"/>
+          <w:sz w:val="22"/>
+          <w:szCs w:val="22"/>
+        </w:rPr>
+        <w:t xml:space="preserve">Le schéma AMD (introduit en Partie II) trouve ici son application concrète : le POI se situe presque toujours juste au-delà d'une liquidité nommable — un Equal High/Low, un haut ou un bas de session, ou une zone d'Inducement — que le prix balaie en premier avant de revenir y réagir.</w:t>
+      </w:r>
+    </w:p>
+    <w:p>
+      <w:pPr>
+        <w:pStyle w:val="Heading3"/>
+        <w:keepNext/>
+        <w:keepLines/>
+      </w:pPr>
+      <w:r>
+        <w:t xml:space="preserve">BPR — Balanced Price Range (zone spécialisée, hors des six types canoniques)</w:t>
+      </w:r>
+    </w:p>
+    <w:p>
+      <w:pPr>
+        <w:spacing w:after="160" w:line="300"/>
+        <w:jc w:val="both"/>
+      </w:pPr>
+      <w:r>
+        <w:rPr>
+          <w:b/>
+          <w:bCs/>
+          <w:color w:val="1E3A8A"/>
+          <w:sz w:val="22"/>
+          <w:szCs w:val="22"/>
+        </w:rPr>
+        <w:t xml:space="preserve">Quoi — </w:t>
+      </w:r>
+      <w:r>
+        <w:rPr>
+          <w:color w:val="1F2937"/>
+          <w:sz w:val="22"/>
+          <w:szCs w:val="22"/>
+        </w:rPr>
+        <w:t xml:space="preserve">La zone de chevauchement exact entre un Fair Value Gap haussier et un Fair Value Gap baissier formés au même niveau — un espace où le prix a laissé, dans les deux sens, un déséquilibre non comblé.</w:t>
+      </w:r>
+    </w:p>
+    <w:p>
+      <w:pPr>
+        <w:spacing w:after="160" w:line="300"/>
+        <w:jc w:val="both"/>
+      </w:pPr>
+      <w:r>
+        <w:rPr>
+          <w:b/>
+          <w:bCs/>
+          <w:color w:val="B45309"/>
+          <w:sz w:val="22"/>
+          <w:szCs w:val="22"/>
+        </w:rPr>
+        <w:t xml:space="preserve">Pourquoi — </w:t>
+      </w:r>
+      <w:r>
+        <w:rPr>
+          <w:color w:val="1F2937"/>
+          <w:sz w:val="22"/>
+          <w:szCs w:val="22"/>
+        </w:rPr>
+        <w:t xml:space="preserve">Cette double origine rend le BPR particulièrement dense en information : deux mouvements impulsifs, dans deux directions différentes, y ont chacun laissé une dette de livraison. Ce n'est pas un septième type de POI générique : c'est une zone spécialisée, réservée au Modèle d'entrée 2 (Sweep + BPR, Partie VII.C), et à lui seul.</w:t>
+      </w:r>
+    </w:p>
+    <w:p>
+      <w:pPr>
+        <w:spacing w:after="160" w:line="300"/>
+        <w:jc w:val="both"/>
+      </w:pPr>
+      <w:r>
+        <w:rPr>
+          <w:b/>
+          <w:bCs/>
+          <w:color w:val="047857"/>
+          <w:sz w:val="22"/>
+          <w:szCs w:val="22"/>
+        </w:rPr>
+        <w:t xml:space="preserve">Comment s'y prendre — </w:t>
+      </w:r>
+      <w:r>
+        <w:rPr>
+          <w:color w:val="1F2937"/>
+          <w:sz w:val="22"/>
+          <w:szCs w:val="22"/>
+        </w:rPr>
+        <w:t xml:space="preserve">Repérer deux FVG de sens opposés qui se chevauchent sur la même plage de prix ; tracer la zone commune aux deux comme BPR.</w:t>
       </w:r>
     </w:p>
     <w:p>
@@ -7626,7 +7351,7 @@
       <w:r>
         <w:drawing>
           <wp:inline distT="0" distB="0" distL="0" distR="0">
-            <wp:extent cx="5619750" cy="2686050"/>
+            <wp:extent cx="5619750" cy="3819525"/>
             <wp:effectExtent t="0" r="0" b="0" l="0"/>
             <wp:docPr id="1" name="" descr="" title=""/>
             <wp:cNvGraphicFramePr>
@@ -7651,6 +7376,371 @@
                   <pic:spPr bwMode="auto">
                     <a:xfrm>
                       <a:off x="0" y="0"/>
+                      <a:ext cx="5619750" cy="3819525"/>
+                    </a:xfrm>
+                    <a:prstGeom prst="rect">
+                      <a:avLst/>
+                    </a:prstGeom>
+                  </pic:spPr>
+                </pic:pic>
+              </a:graphicData>
+            </a:graphic>
+          </wp:inline>
+        </w:drawing>
+      </w:r>
+    </w:p>
+    <w:p>
+      <w:pPr>
+        <w:spacing w:after="220"/>
+        <w:jc w:val="center"/>
+      </w:pPr>
+      <w:r>
+        <w:rPr>
+          <w:i/>
+          <w:iCs/>
+          <w:color w:val="4B5563"/>
+          <w:sz w:val="19"/>
+          <w:szCs w:val="19"/>
+        </w:rPr>
+        <w:t xml:space="preserve">Figure 14 — Le BPR : la zone commune à un FVG haussier et un FVG baissier formés au même niveau.</w:t>
+      </w:r>
+    </w:p>
+    <w:p>
+      <w:pPr>
+        <w:pStyle w:val="Heading3"/>
+        <w:keepNext/>
+        <w:keepLines/>
+      </w:pPr>
+      <w:r>
+        <w:t xml:space="preserve">Judas Swing et Dealing Range, appliqués à la sélection de zone</w:t>
+      </w:r>
+    </w:p>
+    <w:p>
+      <w:pPr>
+        <w:spacing w:after="160" w:line="300"/>
+        <w:jc w:val="both"/>
+      </w:pPr>
+      <w:r>
+        <w:rPr>
+          <w:color w:val="1F2937"/>
+          <w:sz w:val="22"/>
+          <w:szCs w:val="22"/>
+        </w:rPr>
+        <w:t xml:space="preserve">Le Judas Swing (défini en Partie V comme la phase de Manipulation du cycle MMXM) trouve ici son utilité pratique directe : le mouvement de manipulation qui balaie la liquidité d'un côté du Dealing Range (l'autre nom, utilisé par certaines ressources, pour désigner le Range HTF ou le couloir d'Accumulation asiatique) est précisément ce qui doit être identifié avant de considérer la zone opposée comme un POI valide. Confirmer qu'un Judas Swing a eu lieu, c'est confirmer que le « piège » institutionnel est refermé — condition nécessaire, mais non suffisante seule, avant de chercher une entrée.</w:t>
+      </w:r>
+    </w:p>
+    <w:p>
+      <w:pPr>
+        <w:keepNext/>
+        <w:keepLines/>
+        <w:pBdr>
+          <w:left w:val="single" w:color="047857" w:sz="24" w:space="8"/>
+        </w:pBdr>
+        <w:shd w:fill="E1F3EC" w:val="clear"/>
+        <w:spacing w:after="60" w:before="200"/>
+      </w:pPr>
+      <w:r>
+        <w:rPr>
+          <w:b/>
+          <w:bCs/>
+          <w:color w:val="047857"/>
+          <w:sz w:val="22"/>
+          <w:szCs w:val="22"/>
+        </w:rPr>
+        <w:t xml:space="preserve">Questions de vérification</w:t>
+      </w:r>
+    </w:p>
+    <w:p>
+      <w:pPr>
+        <w:keepNext/>
+        <w:keepLines/>
+        <w:pBdr>
+          <w:left w:val="single" w:color="047857" w:sz="24" w:space="8"/>
+        </w:pBdr>
+        <w:shd w:fill="E1F3EC" w:val="clear"/>
+        <w:spacing w:after="80" w:line="280"/>
+        <w:jc w:val="both"/>
+      </w:pPr>
+      <w:r>
+        <w:rPr>
+          <w:i/>
+          <w:iCs/>
+          <w:color w:val="1F2937"/>
+          <w:sz w:val="21"/>
+          <w:szCs w:val="21"/>
+        </w:rPr>
+        <w:t xml:space="preserve">• Face à deux niveaux de liquidité sur un même graphique, saurais-je justifier lequel est probablement le DOL global et lequel est un IDM, à partir des cinq critères de qualification — pas d'une impression ?</w:t>
+      </w:r>
+    </w:p>
+    <w:p>
+      <w:pPr>
+        <w:keepNext/>
+        <w:keepLines/>
+        <w:pBdr>
+          <w:left w:val="single" w:color="047857" w:sz="24" w:space="8"/>
+        </w:pBdr>
+        <w:shd w:fill="E1F3EC" w:val="clear"/>
+        <w:spacing w:after="80" w:line="280"/>
+        <w:jc w:val="both"/>
+      </w:pPr>
+      <w:r>
+        <w:rPr>
+          <w:i/>
+          <w:iCs/>
+          <w:color w:val="1F2937"/>
+          <w:sz w:val="21"/>
+          <w:szCs w:val="21"/>
+        </w:rPr>
+        <w:t xml:space="preserve">• Est-ce que je peux nommer, sans les confondre, les six types de POI de la méthode IPF et donner un trait distinctif de chacun ?</w:t>
+      </w:r>
+    </w:p>
+    <w:p>
+      <w:pPr>
+        <w:keepNext/>
+        <w:keepLines/>
+        <w:pBdr>
+          <w:left w:val="single" w:color="047857" w:sz="24" w:space="8"/>
+        </w:pBdr>
+        <w:shd w:fill="E1F3EC" w:val="clear"/>
+        <w:spacing w:after="80" w:line="280"/>
+        <w:jc w:val="both"/>
+      </w:pPr>
+      <w:r>
+        <w:rPr>
+          <w:i/>
+          <w:iCs/>
+          <w:color w:val="1F2937"/>
+          <w:sz w:val="21"/>
+          <w:szCs w:val="21"/>
+        </w:rPr>
+        <w:t xml:space="preserve">• Face à un POI qui obtient un bon score sur cinq critères mais qui échoue sur le critère ⑥ (liquidité adjacente), est-ce que je sais que ce POI doit être rejeté malgré tout ?</w:t>
+      </w:r>
+    </w:p>
+    <w:p>
+      <w:pPr>
+        <w:keepNext w:val="false"/>
+        <w:keepLines/>
+        <w:pBdr>
+          <w:left w:val="single" w:color="047857" w:sz="24" w:space="8"/>
+        </w:pBdr>
+        <w:shd w:fill="E1F3EC" w:val="clear"/>
+        <w:spacing w:after="200" w:line="280"/>
+        <w:jc w:val="both"/>
+      </w:pPr>
+      <w:r>
+        <w:rPr>
+          <w:i/>
+          <w:iCs/>
+          <w:color w:val="1F2937"/>
+          <w:sz w:val="21"/>
+          <w:szCs w:val="21"/>
+        </w:rPr>
+        <w:t xml:space="preserve">• Est-ce que je comprends la différence entre la grille à 6 critères (qualification stricte) et la grille à 8 confluences/Tier (comparaison rapide entre zones candidates) ?</w:t>
+      </w:r>
+    </w:p>
+    <w:p>
+      <w:r>
+        <w:br w:type="page"/>
+      </w:r>
+    </w:p>
+    <w:p>
+      <w:pPr>
+        <w:pStyle w:val="Heading2"/>
+        <w:keepNext/>
+        <w:keepLines/>
+      </w:pPr>
+      <w:r>
+        <w:t xml:space="preserve">C. Étape F — Fractal Model &amp; Exécution LTF</w:t>
+      </w:r>
+    </w:p>
+    <w:p>
+      <w:pPr>
+        <w:spacing w:after="160" w:line="300"/>
+        <w:jc w:val="both"/>
+      </w:pPr>
+      <w:r>
+        <w:rPr>
+          <w:color w:val="1F2937"/>
+          <w:sz w:val="22"/>
+          <w:szCs w:val="22"/>
+        </w:rPr>
+        <w:t xml:space="preserve">Un biais correct (Étape I) et une zone qualifiée (Étape P) ne suffisent pas encore à autoriser une entrée. L'Étape F répond à la dernière question : sur le timeframe d'exécution, quelle confirmation précise atteste que la réaction attendue est réellement en train de se produire ?</w:t>
+      </w:r>
+    </w:p>
+    <w:p>
+      <w:pPr>
+        <w:pStyle w:val="Heading3"/>
+        <w:keepNext/>
+        <w:keepLines/>
+      </w:pPr>
+      <w:r>
+        <w:t xml:space="preserve">BOS et ChoCH — une distinction qui ne souffre aucune exception</w:t>
+      </w:r>
+    </w:p>
+    <w:p>
+      <w:pPr>
+        <w:keepNext/>
+        <w:keepLines/>
+        <w:spacing w:after="80" w:before="200"/>
+      </w:pPr>
+      <w:r>
+        <w:rPr>
+          <w:b/>
+          <w:bCs/>
+          <w:color w:val="1E3A8A"/>
+          <w:sz w:val="22"/>
+          <w:szCs w:val="22"/>
+        </w:rPr>
+        <w:t xml:space="preserve">BOS (Break of Structure) et ChoCH (Change of Character)</w:t>
+      </w:r>
+    </w:p>
+    <w:p>
+      <w:pPr>
+        <w:spacing w:after="160" w:line="300"/>
+        <w:jc w:val="both"/>
+      </w:pPr>
+      <w:r>
+        <w:rPr>
+          <w:b/>
+          <w:bCs/>
+          <w:color w:val="1E3A8A"/>
+          <w:sz w:val="22"/>
+          <w:szCs w:val="22"/>
+        </w:rPr>
+        <w:t xml:space="preserve">Quoi — </w:t>
+      </w:r>
+      <w:r>
+        <w:rPr>
+          <w:color w:val="1F2937"/>
+          <w:sz w:val="22"/>
+          <w:szCs w:val="22"/>
+        </w:rPr>
+        <w:t xml:space="preserve">Le BOS confirme une continuation dans le sens de la tendance déjà en cours : un nouveau sommet (ou creux) qui dépasse le précédent, dans le même sens que la structure établie. Le ChoCH est le premier signe structurel qu'un retournement de contrôle a eu lieu sur le timeframe d'exécution : un plus haut qui échoue à dépasser le précédent dans un marché haussier (ou l'inverse), suivi d'une cassure dans le sens opposé.</w:t>
+      </w:r>
+    </w:p>
+    <w:p>
+      <w:pPr>
+        <w:spacing w:after="160" w:line="300"/>
+        <w:jc w:val="both"/>
+      </w:pPr>
+      <w:r>
+        <w:rPr>
+          <w:b/>
+          <w:bCs/>
+          <w:color w:val="B45309"/>
+          <w:sz w:val="22"/>
+          <w:szCs w:val="22"/>
+        </w:rPr>
+        <w:t xml:space="preserve">Pourquoi — </w:t>
+      </w:r>
+      <w:r>
+        <w:rPr>
+          <w:color w:val="1F2937"/>
+          <w:sz w:val="22"/>
+          <w:szCs w:val="22"/>
+        </w:rPr>
+        <w:t xml:space="preserve">Le BOS et le ChoCH ne mesurent pas la même chose : confondre les deux revient à confondre « la tendance continue » et « la tendance vient de s'inverser » — une erreur qui, à l'échelle de l'exécution, transforme une entrée de continuation en une entrée de retournement sans que le trader s'en rende compte.</w:t>
+      </w:r>
+    </w:p>
+    <w:p>
+      <w:pPr>
+        <w:spacing w:after="160" w:line="300"/>
+        <w:jc w:val="both"/>
+      </w:pPr>
+      <w:r>
+        <w:rPr>
+          <w:b/>
+          <w:bCs/>
+          <w:color w:val="047857"/>
+          <w:sz w:val="22"/>
+          <w:szCs w:val="22"/>
+        </w:rPr>
+        <w:t xml:space="preserve">Comment s'y prendre — </w:t>
+      </w:r>
+      <w:r>
+        <w:rPr>
+          <w:color w:val="1F2937"/>
+          <w:sz w:val="22"/>
+          <w:szCs w:val="22"/>
+        </w:rPr>
+        <w:t xml:space="preserve">Sur le timeframe d'exécution, identifier si le nouveau swing prolonge la structure précédente (BOS) ou la contredit pour la première fois (ChoCH) ; ne valider un ChoCH qu'à la clôture de la bougie qui le confirme — un ChoCH en cours de bougie n'existe pas, il peut être annulé avant la fermeture.</w:t>
+      </w:r>
+    </w:p>
+    <w:p>
+      <w:pPr>
+        <w:spacing w:after="160"/>
+        <w:jc w:val="both"/>
+      </w:pPr>
+      <w:r>
+        <w:rPr>
+          <w:b/>
+          <w:bCs/>
+          <w:i/>
+          <w:iCs/>
+          <w:color w:val="1F2937"/>
+          <w:sz w:val="22"/>
+          <w:szCs w:val="22"/>
+        </w:rPr>
+        <w:t xml:space="preserve">Lien avec IPF — </w:t>
+      </w:r>
+      <w:r>
+        <w:rPr>
+          <w:i/>
+          <w:iCs/>
+          <w:color w:val="1F2937"/>
+          <w:sz w:val="22"/>
+          <w:szCs w:val="22"/>
+        </w:rPr>
+        <w:t xml:space="preserve">C'est la condition 05 du Verdict (Partie VIII), qui exige spécifiquement un ChoCH confirmé — jamais un simple BOS — avant d'envisager une entrée.</w:t>
+      </w:r>
+    </w:p>
+    <w:p>
+      <w:pPr>
+        <w:spacing w:after="160" w:line="300"/>
+        <w:jc w:val="both"/>
+      </w:pPr>
+      <w:r>
+        <w:rPr>
+          <w:color w:val="1F2937"/>
+          <w:sz w:val="22"/>
+          <w:szCs w:val="22"/>
+        </w:rPr>
+        <w:t xml:space="preserve">Note de correspondance terminologique : certaines ressources — notamment le document de référence interne « Détails étape par étape » et la fiche de terrain A4 de BK-BOOST Ltd. — utilisent le terme MSS (Market Structure Shift) à la place, ou aux côtés, de ChoCH. Ce manuel fait le choix délibéré de ne retenir qu'un seul terme, ChoCH, pour désigner ce retournement de contrôle, afin d'éliminer toute ambiguïté : partout où vous croiserez « MSS » dans un autre document de BK-BOOST Ltd., lisez ChoCH.</w:t>
+      </w:r>
+    </w:p>
+    <w:p>
+      <w:pPr>
+        <w:spacing w:after="100" w:before="200"/>
+        <w:jc w:val="center"/>
+      </w:pPr>
+      <w:r>
+        <w:drawing>
+          <wp:inline distT="0" distB="0" distL="0" distR="0">
+            <wp:extent cx="5619750" cy="2686050"/>
+            <wp:effectExtent t="0" r="0" b="0" l="0"/>
+            <wp:docPr id="1" name="" descr="" title=""/>
+            <wp:cNvGraphicFramePr>
+              <a:graphicFrameLocks xmlns:a="http://schemas.openxmlformats.org/drawingml/2006/main" noChangeAspect="1"/>
+            </wp:cNvGraphicFramePr>
+            <a:graphic xmlns:a="http://schemas.openxmlformats.org/drawingml/2006/main">
+              <a:graphicData uri="http://schemas.openxmlformats.org/drawingml/2006/picture">
+                <pic:pic xmlns:pic="http://schemas.openxmlformats.org/drawingml/2006/picture">
+                  <pic:nvPicPr>
+                    <pic:cNvPr id="0" name="" descr=""/>
+                    <pic:cNvPicPr>
+                      <a:picLocks noChangeAspect="1" noChangeArrowheads="1"/>
+                    </pic:cNvPicPr>
+                  </pic:nvPicPr>
+                  <pic:blipFill>
+                    <a:blip r:embed="rId25" cstate="none"/>
+                    <a:srcRect/>
+                    <a:stretch>
+                      <a:fillRect/>
+                    </a:stretch>
+                  </pic:blipFill>
+                  <pic:spPr bwMode="auto">
+                    <a:xfrm>
+                      <a:off x="0" y="0"/>
                       <a:ext cx="5619750" cy="2686050"/>
                     </a:xfrm>
                     <a:prstGeom prst="rect">
@@ -7948,7 +8038,7 @@
                     </pic:cNvPicPr>
                   </pic:nvPicPr>
                   <pic:blipFill>
-                    <a:blip r:embed="rId25" cstate="none"/>
+                    <a:blip r:embed="rId26" cstate="none"/>
                     <a:srcRect/>
                     <a:stretch>
                       <a:fillRect/>
@@ -10583,7 +10673,7 @@
                     </pic:cNvPicPr>
                   </pic:nvPicPr>
                   <pic:blipFill>
-                    <a:blip r:embed="rId26" cstate="none"/>
+                    <a:blip r:embed="rId27" cstate="none"/>
                     <a:srcRect/>
                     <a:stretch>
                       <a:fillRect/>

</xml_diff>

<commit_message>
Fix blank page 23 caused by a fragile manual page break
Partie VII used standalone page-break paragraphs between its four
Étape sub-sections. That pattern is fragile: when the preceding
content happens to end right at a page's bottom edge, Word/LibreOffice
can render a genuinely blank intervening page rather than starting the
next section immediately. The CRT content added in the previous
commit shifted pagination just enough to trigger it on page 23.

Replaced the standalone breaks with pageBreakBefore set directly on
each sub-section's heading paragraph — the same safe technique already
used for Partie-level headings — which cannot produce a blank page.
Verified across all 48 pages of the rebuilt PDF: none are blank.
Manual is back to 48 pages (the fix reclaimed enough space to offset
the CRT addition); regenerated all reader page images and PDF/DOCX,
and reverted the page-count stat shown on the portfolio card.

Co-Authored-By: Claude Sonnet 5 <noreply@anthropic.com>
</commit_message>
<xml_diff>
--- a/public/full-guideline-bk-boost-ipf.docx
+++ b/public/full-guideline-bk-boost-ipf.docx
@@ -343,7 +343,7 @@
           <w:sz w:val="22"/>
           <w:szCs w:val="22"/>
         </w:rPr>
-        <w:t xml:space="preserve">	38</w:t>
+        <w:t xml:space="preserve">	37</w:t>
       </w:r>
     </w:p>
     <w:p>
@@ -373,7 +373,7 @@
           <w:sz w:val="22"/>
           <w:szCs w:val="22"/>
         </w:rPr>
-        <w:t xml:space="preserve">	42</w:t>
+        <w:t xml:space="preserve">	41</w:t>
       </w:r>
     </w:p>
     <w:p>
@@ -403,7 +403,7 @@
           <w:sz w:val="22"/>
           <w:szCs w:val="22"/>
         </w:rPr>
-        <w:t xml:space="preserve">	44</w:t>
+        <w:t xml:space="preserve">	43</w:t>
       </w:r>
     </w:p>
     <w:p>
@@ -433,7 +433,7 @@
           <w:sz w:val="22"/>
           <w:szCs w:val="22"/>
         </w:rPr>
-        <w:t xml:space="preserve">	45</w:t>
+        <w:t xml:space="preserve">	44</w:t>
       </w:r>
     </w:p>
     <w:p>
@@ -4461,7 +4461,7 @@
         </w:rPr>
         <w:t xml:space="preserve">Ressources pour l'analyse fondamentale — </w:t>
       </w:r>
-      <w:hyperlink w:history="1" r:id="rIdlyyhlekxtiiaiuzp7swfw">
+      <w:hyperlink w:history="1" r:id="rId7qr0n4uhhmvd0psrdcusx">
         <w:r>
           <w:rPr>
             <w:i/>
@@ -4482,7 +4482,7 @@
         </w:rPr>
         <w:t xml:space="preserve">   ·   </w:t>
       </w:r>
-      <w:hyperlink w:history="1" r:id="rIdm60rrztcw6gal40kmig5d">
+      <w:hyperlink w:history="1" r:id="rIdambfzujzmmp9uge6luch2">
         <w:r>
           <w:rPr>
             <w:i/>
@@ -4503,7 +4503,7 @@
         </w:rPr>
         <w:t xml:space="preserve">   ·   </w:t>
       </w:r>
-      <w:hyperlink w:history="1" r:id="rIdq1um5p0mg7fy2akz-frb4">
+      <w:hyperlink w:history="1" r:id="rIdmw6rxpipfuhquwmgdh_he">
         <w:r>
           <w:rPr>
             <w:i/>
@@ -4623,7 +4623,7 @@
         </w:rPr>
         <w:t xml:space="preserve">Ressource pour l'analyse sentimentale — </w:t>
       </w:r>
-      <w:hyperlink w:history="1" r:id="rIdf7bo6zznz5o1qd_3dybi6">
+      <w:hyperlink w:history="1" r:id="rIdbsg0biqnffy97jay6sbdt">
         <w:r>
           <w:rPr>
             <w:i/>
@@ -5513,15 +5513,11 @@
       </w:r>
     </w:p>
     <w:p>
-      <w:r>
-        <w:br w:type="page"/>
-      </w:r>
-    </w:p>
-    <w:p>
       <w:pPr>
         <w:pStyle w:val="Heading2"/>
         <w:keepNext/>
         <w:keepLines/>
+        <w:pageBreakBefore/>
       </w:pPr>
       <w:r>
         <w:t xml:space="preserve">B. Étape P — Price Action &amp; Liquidité</w:t>
@@ -7539,15 +7535,11 @@
       </w:r>
     </w:p>
     <w:p>
-      <w:r>
-        <w:br w:type="page"/>
-      </w:r>
-    </w:p>
-    <w:p>
       <w:pPr>
         <w:pStyle w:val="Heading2"/>
         <w:keepNext/>
         <w:keepLines/>
+        <w:pageBreakBefore/>
       </w:pPr>
       <w:r>
         <w:t xml:space="preserve">C. Étape F — Fractal Model &amp; Exécution LTF</w:t>
@@ -8510,15 +8502,11 @@
       </w:r>
     </w:p>
     <w:p>
-      <w:r>
-        <w:br w:type="page"/>
-      </w:r>
-    </w:p>
-    <w:p>
       <w:pPr>
         <w:pStyle w:val="Heading2"/>
         <w:keepNext/>
         <w:keepLines/>
+        <w:pageBreakBefore/>
       </w:pPr>
       <w:r>
         <w:t xml:space="preserve">D. Les quatre profils de trader</w:t>

</xml_diff>